<commit_message>
att: dados de dezembro
</commit_message>
<xml_diff>
--- a/00. Piloto da KALK/PILOTO DA KALK.docx
+++ b/00. Piloto da KALK/PILOTO DA KALK.docx
@@ -1,17 +1,17 @@
 
 <file path=word/document.xml><?xml version="1.0" encoding="utf-8"?>
-<w:document xmlns:wpc="http://schemas.microsoft.com/office/word/2010/wordprocessingCanvas" xmlns:mc="http://schemas.openxmlformats.org/markup-compatibility/2006" xmlns:o="urn:schemas-microsoft-com:office:office" xmlns:r="http://schemas.openxmlformats.org/officeDocument/2006/relationships" xmlns:m="http://schemas.openxmlformats.org/officeDocument/2006/math" xmlns:v="urn:schemas-microsoft-com:vml" xmlns:wp14="http://schemas.microsoft.com/office/word/2010/wordprocessingDrawing" xmlns:wp="http://schemas.openxmlformats.org/drawingml/2006/wordprocessingDrawing" xmlns:w10="urn:schemas-microsoft-com:office:word" xmlns:w="http://schemas.openxmlformats.org/wordprocessingml/2006/main" xmlns:w14="http://schemas.microsoft.com/office/word/2010/wordml" xmlns:w15="http://schemas.microsoft.com/office/word/2012/wordml" xmlns:wpg="http://schemas.microsoft.com/office/word/2010/wordprocessingGroup" xmlns:wpi="http://schemas.microsoft.com/office/word/2010/wordprocessingInk" xmlns:wne="http://schemas.microsoft.com/office/word/2006/wordml" xmlns:wps="http://schemas.microsoft.com/office/word/2010/wordprocessingShape" xmlns:w16se="http://schemas.microsoft.com/office/word/2015/wordml/symex" xmlns:w16cid="http://schemas.microsoft.com/office/word/2016/wordml/cid" xmlns:w16="http://schemas.microsoft.com/office/word/2018/wordml" xmlns:w16cex="http://schemas.microsoft.com/office/word/2018/wordml/cex" xmlns:w16sdtdh="http://schemas.microsoft.com/office/word/2020/wordml/sdtdatahash" xmlns:w16sdtfl="http://schemas.microsoft.com/office/word/2024/wordml/sdtformatlock" mc:Ignorable="w14 w15 wp14 w16se w16cid w16 w16cex w16sdtdh w16sdtfl">
+<w:document xmlns:wpc="http://schemas.microsoft.com/office/word/2010/wordprocessingCanvas" xmlns:cx="http://schemas.microsoft.com/office/drawing/2014/chartex" xmlns:cx1="http://schemas.microsoft.com/office/drawing/2015/9/8/chartex" xmlns:cx2="http://schemas.microsoft.com/office/drawing/2015/10/21/chartex" xmlns:cx3="http://schemas.microsoft.com/office/drawing/2016/5/9/chartex" xmlns:cx4="http://schemas.microsoft.com/office/drawing/2016/5/10/chartex" xmlns:cx5="http://schemas.microsoft.com/office/drawing/2016/5/11/chartex" xmlns:cx6="http://schemas.microsoft.com/office/drawing/2016/5/12/chartex" xmlns:cx7="http://schemas.microsoft.com/office/drawing/2016/5/13/chartex" xmlns:cx8="http://schemas.microsoft.com/office/drawing/2016/5/14/chartex" xmlns:mc="http://schemas.openxmlformats.org/markup-compatibility/2006" xmlns:aink="http://schemas.microsoft.com/office/drawing/2016/ink" xmlns:am3d="http://schemas.microsoft.com/office/drawing/2017/model3d" xmlns:o="urn:schemas-microsoft-com:office:office" xmlns:oel="http://schemas.microsoft.com/office/2019/extlst" xmlns:r="http://schemas.openxmlformats.org/officeDocument/2006/relationships" xmlns:m="http://schemas.openxmlformats.org/officeDocument/2006/math" xmlns:v="urn:schemas-microsoft-com:vml" xmlns:wp14="http://schemas.microsoft.com/office/word/2010/wordprocessingDrawing" xmlns:wp="http://schemas.openxmlformats.org/drawingml/2006/wordprocessingDrawing" xmlns:w10="urn:schemas-microsoft-com:office:word" xmlns:w="http://schemas.openxmlformats.org/wordprocessingml/2006/main" xmlns:w14="http://schemas.microsoft.com/office/word/2010/wordml" xmlns:w15="http://schemas.microsoft.com/office/word/2012/wordml" xmlns:w16cex="http://schemas.microsoft.com/office/word/2018/wordml/cex" xmlns:w16cid="http://schemas.microsoft.com/office/word/2016/wordml/cid" xmlns:w16="http://schemas.microsoft.com/office/word/2018/wordml" xmlns:w16du="http://schemas.microsoft.com/office/word/2023/wordml/word16du" xmlns:w16sdtdh="http://schemas.microsoft.com/office/word/2020/wordml/sdtdatahash" xmlns:w16sdtfl="http://schemas.microsoft.com/office/word/2024/wordml/sdtformatlock" xmlns:w16se="http://schemas.microsoft.com/office/word/2015/wordml/symex" xmlns:wpg="http://schemas.microsoft.com/office/word/2010/wordprocessingGroup" xmlns:wpi="http://schemas.microsoft.com/office/word/2010/wordprocessingInk" xmlns:wne="http://schemas.microsoft.com/office/word/2006/wordml" xmlns:wps="http://schemas.microsoft.com/office/word/2010/wordprocessingShape" mc:Ignorable="w14 w15 w16se w16cid w16 w16cex w16sdtdh w16sdtfl w16du wp14">
   <w:body>
-    <w:p xmlns:wp14="http://schemas.microsoft.com/office/word/2010/wordml" wp14:paraId="1E207724" wp14:textId="03271F11">
+    <w:p>
       <w:pPr>
         <w:jc w:val="center"/>
         <w:rPr>
-          <w:rFonts w:ascii="Arial Nova" w:hAnsi="Arial Nova" w:eastAsia="Arial Nova" w:cs="Arial Nova"/>
-        </w:rPr>
-      </w:pPr>
-      <w:r>
-        <w:rPr>
-          <w:rFonts w:ascii="Arial Nova" w:hAnsi="Arial Nova" w:eastAsia="Arial Nova" w:cs="Arial Nova"/>
+          <w:rFonts w:ascii="Arial Nova" w:eastAsia="Arial Nova" w:hAnsi="Arial Nova" w:cs="Arial Nova"/>
+        </w:rPr>
+      </w:pPr>
+      <w:r>
+        <w:rPr>
+          <w:rFonts w:ascii="Arial Nova" w:eastAsia="Arial Nova" w:hAnsi="Arial Nova" w:cs="Arial Nova"/>
         </w:rPr>
         <w:t>PILOTO DA KALK</w:t>
       </w:r>
@@ -20,781 +20,636 @@
       <w:pPr>
         <w:jc w:val="center"/>
         <w:rPr>
-          <w:rFonts w:ascii="Arial Nova" w:hAnsi="Arial Nova" w:eastAsia="Arial Nova" w:cs="Arial Nova"/>
-        </w:rPr>
-      </w:pPr>
-    </w:p>
-    <w:p>
-      <w:pPr>
-        <w:spacing w:before="210" w:beforeAutospacing="off" w:after="210" w:afterAutospacing="off"/>
-        <w:jc w:val="left"/>
-      </w:pPr>
-      <w:r>
-        <w:rPr>
-          <w:rFonts w:ascii="Segoe UI" w:hAnsi="Segoe UI" w:eastAsia="Segoe UI" w:cs="Segoe UI"/>
-          <w:b w:val="1"/>
-          <w:bCs w:val="1"/>
-          <w:noProof w:val="0"/>
-          <w:sz w:val="21"/>
-          <w:szCs w:val="21"/>
-          <w:lang w:val="pt-BR"/>
+          <w:rFonts w:ascii="Arial Nova" w:eastAsia="Arial Nova" w:hAnsi="Arial Nova" w:cs="Arial Nova"/>
+        </w:rPr>
+      </w:pPr>
+    </w:p>
+    <w:p>
+      <w:pPr>
+        <w:spacing w:before="210" w:after="210"/>
+      </w:pPr>
+      <w:r>
+        <w:rPr>
+          <w:rFonts w:ascii="Segoe UI" w:eastAsia="Segoe UI" w:hAnsi="Segoe UI" w:cs="Segoe UI"/>
+          <w:b/>
+          <w:bCs/>
+          <w:sz w:val="21"/>
+          <w:szCs w:val="21"/>
         </w:rPr>
         <w:t>Praças (realidades parecidas - Rigor 65):</w:t>
       </w:r>
     </w:p>
     <w:p>
       <w:pPr>
-        <w:pStyle w:val="ListParagraph"/>
+        <w:pStyle w:val="PargrafodaLista"/>
+        <w:numPr>
+          <w:ilvl w:val="0"/>
+          <w:numId w:val="3"/>
+        </w:numPr>
+        <w:spacing w:after="0"/>
+        <w:rPr>
+          <w:rFonts w:ascii="Segoe UI" w:eastAsia="Segoe UI" w:hAnsi="Segoe UI" w:cs="Segoe UI"/>
+          <w:sz w:val="21"/>
+          <w:szCs w:val="21"/>
+        </w:rPr>
+      </w:pPr>
+      <w:r>
+        <w:rPr>
+          <w:rFonts w:ascii="Segoe UI" w:eastAsia="Segoe UI" w:hAnsi="Segoe UI" w:cs="Segoe UI"/>
+          <w:sz w:val="21"/>
+          <w:szCs w:val="21"/>
+        </w:rPr>
+        <w:t>Nevaldo (acima do ideal - 4)</w:t>
+      </w:r>
+    </w:p>
+    <w:p>
+      <w:pPr>
+        <w:pStyle w:val="PargrafodaLista"/>
+        <w:numPr>
+          <w:ilvl w:val="0"/>
+          <w:numId w:val="3"/>
+        </w:numPr>
+        <w:spacing w:after="0"/>
+        <w:rPr>
+          <w:rFonts w:ascii="Segoe UI" w:eastAsia="Segoe UI" w:hAnsi="Segoe UI" w:cs="Segoe UI"/>
+          <w:sz w:val="21"/>
+          <w:szCs w:val="21"/>
+        </w:rPr>
+      </w:pPr>
+      <w:r>
+        <w:rPr>
+          <w:rFonts w:ascii="Segoe UI" w:eastAsia="Segoe UI" w:hAnsi="Segoe UI" w:cs="Segoe UI"/>
+          <w:sz w:val="21"/>
+          <w:szCs w:val="21"/>
+        </w:rPr>
+        <w:t>Centro Mossoró (abaixo do ideal - 13)</w:t>
+      </w:r>
+    </w:p>
+    <w:p>
+      <w:pPr>
+        <w:spacing w:before="210" w:after="210"/>
+        <w:rPr>
+          <w:rFonts w:ascii="Segoe UI" w:eastAsia="Segoe UI" w:hAnsi="Segoe UI" w:cs="Segoe UI"/>
+          <w:b/>
+          <w:bCs/>
+          <w:sz w:val="21"/>
+          <w:szCs w:val="21"/>
+        </w:rPr>
+      </w:pPr>
+      <w:r>
+        <w:rPr>
+          <w:rFonts w:ascii="Segoe UI" w:eastAsia="Segoe UI" w:hAnsi="Segoe UI" w:cs="Segoe UI"/>
+          <w:b/>
+          <w:bCs/>
+          <w:sz w:val="21"/>
+          <w:szCs w:val="21"/>
+        </w:rPr>
+        <w:t>Analisar os indicadores</w:t>
+      </w:r>
+      <w:r>
+        <w:rPr>
+          <w:rFonts w:ascii="Segoe UI" w:eastAsia="Segoe UI" w:hAnsi="Segoe UI" w:cs="Segoe UI"/>
+          <w:b/>
+          <w:bCs/>
+          <w:sz w:val="21"/>
+          <w:szCs w:val="21"/>
+        </w:rPr>
+        <w:t>:</w:t>
+      </w:r>
+    </w:p>
+    <w:p>
+      <w:pPr>
+        <w:pStyle w:val="PargrafodaLista"/>
+        <w:numPr>
+          <w:ilvl w:val="0"/>
+          <w:numId w:val="4"/>
+        </w:numPr>
+        <w:spacing w:after="0"/>
+        <w:rPr>
+          <w:rFonts w:ascii="Segoe UI" w:eastAsia="Segoe UI" w:hAnsi="Segoe UI" w:cs="Segoe UI"/>
+          <w:sz w:val="21"/>
+          <w:szCs w:val="21"/>
+          <w:highlight w:val="green"/>
+        </w:rPr>
+      </w:pPr>
+      <w:r>
+        <w:rPr>
+          <w:rFonts w:ascii="Segoe UI" w:eastAsia="Segoe UI" w:hAnsi="Segoe UI" w:cs="Segoe UI"/>
+          <w:sz w:val="21"/>
+          <w:szCs w:val="21"/>
+          <w:highlight w:val="green"/>
+        </w:rPr>
+        <w:t>Amostras das visitas</w:t>
+      </w:r>
+    </w:p>
+    <w:p>
+      <w:pPr>
+        <w:pStyle w:val="PargrafodaLista"/>
+        <w:numPr>
+          <w:ilvl w:val="0"/>
+          <w:numId w:val="4"/>
+        </w:numPr>
+        <w:spacing w:after="0"/>
+        <w:rPr>
+          <w:rFonts w:ascii="Segoe UI" w:eastAsia="Segoe UI" w:hAnsi="Segoe UI" w:cs="Segoe UI"/>
+          <w:sz w:val="21"/>
+          <w:szCs w:val="21"/>
+          <w:highlight w:val="green"/>
+        </w:rPr>
+      </w:pPr>
+      <w:r>
+        <w:rPr>
+          <w:rFonts w:ascii="Segoe UI" w:eastAsia="Segoe UI" w:hAnsi="Segoe UI" w:cs="Segoe UI"/>
+          <w:sz w:val="21"/>
+          <w:szCs w:val="21"/>
+          <w:highlight w:val="green"/>
+        </w:rPr>
+        <w:t>Estrutura, dias e horas operacionais</w:t>
+      </w:r>
+    </w:p>
+    <w:p>
+      <w:pPr>
+        <w:pStyle w:val="PargrafodaLista"/>
+        <w:numPr>
+          <w:ilvl w:val="0"/>
+          <w:numId w:val="4"/>
+        </w:numPr>
+        <w:spacing w:after="0"/>
+        <w:rPr>
+          <w:rFonts w:ascii="Segoe UI" w:eastAsia="Segoe UI" w:hAnsi="Segoe UI" w:cs="Segoe UI"/>
+          <w:sz w:val="21"/>
+          <w:szCs w:val="21"/>
+          <w:highlight w:val="green"/>
+        </w:rPr>
+      </w:pPr>
+      <w:r>
+        <w:rPr>
+          <w:rFonts w:ascii="Segoe UI" w:eastAsia="Segoe UI" w:hAnsi="Segoe UI" w:cs="Segoe UI"/>
+          <w:sz w:val="21"/>
+          <w:szCs w:val="21"/>
+          <w:highlight w:val="green"/>
+        </w:rPr>
+        <w:t xml:space="preserve">Pessoas: </w:t>
+      </w:r>
+      <w:r>
+        <w:rPr>
+          <w:rFonts w:ascii="Segoe UI" w:eastAsia="Segoe UI" w:hAnsi="Segoe UI" w:cs="Segoe UI"/>
+          <w:sz w:val="21"/>
+          <w:szCs w:val="21"/>
+          <w:highlight w:val="green"/>
+        </w:rPr>
+        <w:t>Quantidade</w:t>
+      </w:r>
+      <w:r>
+        <w:rPr>
+          <w:rFonts w:ascii="Segoe UI" w:eastAsia="Segoe UI" w:hAnsi="Segoe UI" w:cs="Segoe UI"/>
+          <w:sz w:val="21"/>
+          <w:szCs w:val="21"/>
+          <w:highlight w:val="green"/>
+        </w:rPr>
+        <w:t xml:space="preserve">, </w:t>
+      </w:r>
+      <w:r>
+        <w:rPr>
+          <w:rFonts w:ascii="Segoe UI" w:eastAsia="Segoe UI" w:hAnsi="Segoe UI" w:cs="Segoe UI"/>
+          <w:sz w:val="21"/>
+          <w:szCs w:val="21"/>
+          <w:highlight w:val="green"/>
+        </w:rPr>
+        <w:t>absenteísmo</w:t>
+      </w:r>
+      <w:r>
+        <w:rPr>
+          <w:rFonts w:ascii="Segoe UI" w:eastAsia="Segoe UI" w:hAnsi="Segoe UI" w:cs="Segoe UI"/>
+          <w:sz w:val="21"/>
+          <w:szCs w:val="21"/>
+        </w:rPr>
+        <w:t xml:space="preserve">, horas extra, rotatividade, </w:t>
+      </w:r>
+      <w:r>
+        <w:rPr>
+          <w:rFonts w:ascii="Segoe UI" w:eastAsia="Segoe UI" w:hAnsi="Segoe UI" w:cs="Segoe UI"/>
+          <w:sz w:val="21"/>
+          <w:szCs w:val="21"/>
+          <w:highlight w:val="green"/>
+        </w:rPr>
+        <w:t>tempo médio de casa</w:t>
+      </w:r>
+    </w:p>
+    <w:p>
+      <w:pPr>
+        <w:pStyle w:val="PargrafodaLista"/>
+        <w:numPr>
+          <w:ilvl w:val="0"/>
+          <w:numId w:val="4"/>
+        </w:numPr>
+        <w:spacing w:after="0"/>
+        <w:rPr>
+          <w:rFonts w:ascii="Segoe UI" w:eastAsia="Segoe UI" w:hAnsi="Segoe UI" w:cs="Segoe UI"/>
+          <w:sz w:val="21"/>
+          <w:szCs w:val="21"/>
+          <w:highlight w:val="green"/>
+        </w:rPr>
+      </w:pPr>
+      <w:r>
+        <w:rPr>
+          <w:rFonts w:ascii="Segoe UI" w:eastAsia="Segoe UI" w:hAnsi="Segoe UI" w:cs="Segoe UI"/>
+          <w:sz w:val="21"/>
+          <w:szCs w:val="21"/>
+          <w:highlight w:val="green"/>
+        </w:rPr>
+        <w:t>Faturamento (vendas e itens)</w:t>
+      </w:r>
+    </w:p>
+    <w:p>
+      <w:pPr>
+        <w:pStyle w:val="PargrafodaLista"/>
+        <w:numPr>
+          <w:ilvl w:val="0"/>
+          <w:numId w:val="4"/>
+        </w:numPr>
+        <w:spacing w:after="0"/>
+        <w:rPr>
+          <w:rFonts w:ascii="Segoe UI" w:eastAsia="Segoe UI" w:hAnsi="Segoe UI" w:cs="Segoe UI"/>
+          <w:sz w:val="21"/>
+          <w:szCs w:val="21"/>
+          <w:highlight w:val="green"/>
+        </w:rPr>
+      </w:pPr>
+      <w:r>
+        <w:rPr>
+          <w:rFonts w:ascii="Segoe UI" w:eastAsia="Segoe UI" w:hAnsi="Segoe UI" w:cs="Segoe UI"/>
+          <w:sz w:val="21"/>
+          <w:szCs w:val="21"/>
+          <w:highlight w:val="green"/>
+        </w:rPr>
+        <w:t>Indicadores: base total, ativa, inícios, pedidos</w:t>
+      </w:r>
+    </w:p>
+    <w:p>
+      <w:pPr>
+        <w:pStyle w:val="PargrafodaLista"/>
+        <w:numPr>
+          <w:ilvl w:val="0"/>
+          <w:numId w:val="4"/>
+        </w:numPr>
+        <w:spacing w:after="0"/>
+        <w:rPr>
+          <w:rFonts w:ascii="Segoe UI" w:eastAsia="Segoe UI" w:hAnsi="Segoe UI" w:cs="Segoe UI"/>
+          <w:sz w:val="21"/>
+          <w:szCs w:val="21"/>
+        </w:rPr>
+      </w:pPr>
+      <w:r>
+        <w:rPr>
+          <w:rFonts w:ascii="Segoe UI" w:eastAsia="Segoe UI" w:hAnsi="Segoe UI" w:cs="Segoe UI"/>
+          <w:sz w:val="21"/>
+          <w:szCs w:val="21"/>
+        </w:rPr>
+        <w:t>Horas produtivas/horas totais</w:t>
+      </w:r>
+    </w:p>
+    <w:p>
+      <w:pPr>
+        <w:pStyle w:val="PargrafodaLista"/>
+        <w:numPr>
+          <w:ilvl w:val="0"/>
+          <w:numId w:val="4"/>
+        </w:numPr>
+        <w:spacing w:after="0"/>
+        <w:rPr>
+          <w:rFonts w:ascii="Segoe UI" w:eastAsia="Segoe UI" w:hAnsi="Segoe UI" w:cs="Segoe UI"/>
+          <w:sz w:val="21"/>
+          <w:szCs w:val="21"/>
+        </w:rPr>
+      </w:pPr>
+      <w:r>
+        <w:rPr>
+          <w:rFonts w:ascii="Segoe UI" w:eastAsia="Segoe UI" w:hAnsi="Segoe UI" w:cs="Segoe UI"/>
+          <w:sz w:val="21"/>
+          <w:szCs w:val="21"/>
+        </w:rPr>
+        <w:t>Pessoas por faixa de fluxo (baixo/médio/alto)</w:t>
+      </w:r>
+    </w:p>
+    <w:p>
+      <w:pPr>
+        <w:pStyle w:val="PargrafodaLista"/>
+        <w:numPr>
+          <w:ilvl w:val="0"/>
+          <w:numId w:val="4"/>
+        </w:numPr>
+        <w:spacing w:after="0"/>
+        <w:rPr>
+          <w:rFonts w:ascii="Segoe UI" w:eastAsia="Segoe UI" w:hAnsi="Segoe UI" w:cs="Segoe UI"/>
+          <w:sz w:val="21"/>
+          <w:szCs w:val="21"/>
+        </w:rPr>
+      </w:pPr>
+      <w:r>
+        <w:rPr>
+          <w:rFonts w:ascii="Segoe UI" w:eastAsia="Segoe UI" w:hAnsi="Segoe UI" w:cs="Segoe UI"/>
+          <w:sz w:val="21"/>
+          <w:szCs w:val="21"/>
+        </w:rPr>
+        <w:t xml:space="preserve">Nº de pessoas na mesma atividade sem necessidade </w:t>
+      </w:r>
+    </w:p>
+    <w:p>
+      <w:pPr>
+        <w:pStyle w:val="PargrafodaLista"/>
+        <w:numPr>
+          <w:ilvl w:val="0"/>
+          <w:numId w:val="4"/>
+        </w:numPr>
+        <w:spacing w:after="0"/>
+        <w:rPr>
+          <w:rFonts w:ascii="Segoe UI" w:eastAsia="Segoe UI" w:hAnsi="Segoe UI" w:cs="Segoe UI"/>
+          <w:sz w:val="21"/>
+          <w:szCs w:val="21"/>
+        </w:rPr>
+      </w:pPr>
+      <w:r>
+        <w:rPr>
+          <w:rFonts w:ascii="Segoe UI" w:eastAsia="Segoe UI" w:hAnsi="Segoe UI" w:cs="Segoe UI"/>
+          <w:sz w:val="21"/>
+          <w:szCs w:val="21"/>
+        </w:rPr>
+        <w:t>Atividades de baixo valor percebido</w:t>
+      </w:r>
+      <w:r>
+        <w:rPr>
+          <w:rFonts w:ascii="Segoe UI" w:eastAsia="Segoe UI" w:hAnsi="Segoe UI" w:cs="Segoe UI"/>
+          <w:sz w:val="21"/>
+          <w:szCs w:val="21"/>
+        </w:rPr>
+        <w:t xml:space="preserve"> e tempo dedicado</w:t>
+      </w:r>
+    </w:p>
+    <w:p>
+      <w:pPr>
+        <w:pStyle w:val="PargrafodaLista"/>
+        <w:spacing w:after="0"/>
+      </w:pPr>
+    </w:p>
+    <w:p>
+      <w:pPr>
+        <w:spacing w:before="210" w:after="210"/>
+      </w:pPr>
+      <w:r>
+        <w:rPr>
+          <w:rFonts w:ascii="Segoe UI" w:eastAsia="Segoe UI" w:hAnsi="Segoe UI" w:cs="Segoe UI"/>
+          <w:sz w:val="21"/>
+          <w:szCs w:val="21"/>
+        </w:rPr>
+        <w:t xml:space="preserve"> </w:t>
+      </w:r>
+    </w:p>
+    <w:p>
+      <w:pPr>
+        <w:spacing w:before="210" w:after="210"/>
+      </w:pPr>
+      <w:r>
+        <w:rPr>
+          <w:rFonts w:ascii="Segoe UI" w:eastAsia="Segoe UI" w:hAnsi="Segoe UI" w:cs="Segoe UI"/>
+          <w:b/>
+          <w:bCs/>
+          <w:sz w:val="21"/>
+          <w:szCs w:val="21"/>
+        </w:rPr>
+        <w:t>Sugestões:</w:t>
+      </w:r>
+    </w:p>
+    <w:p>
+      <w:pPr>
+        <w:pStyle w:val="PargrafodaLista"/>
         <w:numPr>
           <w:ilvl w:val="0"/>
           <w:numId w:val="2"/>
         </w:numPr>
-        <w:spacing w:before="0" w:beforeAutospacing="off" w:after="0" w:afterAutospacing="off"/>
-        <w:jc w:val="left"/>
-        <w:rPr>
-          <w:rFonts w:ascii="Segoe UI" w:hAnsi="Segoe UI" w:eastAsia="Segoe UI" w:cs="Segoe UI"/>
-          <w:noProof w:val="0"/>
-          <w:sz w:val="21"/>
-          <w:szCs w:val="21"/>
-          <w:lang w:val="pt-BR"/>
-        </w:rPr>
-      </w:pPr>
-      <w:r>
-        <w:rPr>
-          <w:rFonts w:ascii="Segoe UI" w:hAnsi="Segoe UI" w:eastAsia="Segoe UI" w:cs="Segoe UI"/>
-          <w:noProof w:val="0"/>
-          <w:sz w:val="21"/>
-          <w:szCs w:val="21"/>
-          <w:lang w:val="pt-BR"/>
-        </w:rPr>
-        <w:t>Nevaldo (acima do ideal - 4)</w:t>
-      </w:r>
-    </w:p>
-    <w:p>
-      <w:pPr>
-        <w:pStyle w:val="ListParagraph"/>
+        <w:spacing w:after="0"/>
+        <w:rPr>
+          <w:rFonts w:ascii="Segoe UI" w:eastAsia="Segoe UI" w:hAnsi="Segoe UI" w:cs="Segoe UI"/>
+          <w:sz w:val="21"/>
+          <w:szCs w:val="21"/>
+        </w:rPr>
+      </w:pPr>
+      <w:r>
+        <w:rPr>
+          <w:rFonts w:ascii="Segoe UI" w:eastAsia="Segoe UI" w:hAnsi="Segoe UI" w:cs="Segoe UI"/>
+          <w:sz w:val="21"/>
+          <w:szCs w:val="21"/>
+        </w:rPr>
+        <w:t>Definir parâmetros de análise (avaliar e acompanhar indicadores chaves e de capacidade produtiva)</w:t>
+      </w:r>
+    </w:p>
+    <w:p>
+      <w:pPr>
+        <w:pStyle w:val="PargrafodaLista"/>
         <w:numPr>
           <w:ilvl w:val="0"/>
           <w:numId w:val="2"/>
         </w:numPr>
-        <w:spacing w:before="0" w:beforeAutospacing="off" w:after="0" w:afterAutospacing="off"/>
-        <w:jc w:val="left"/>
-        <w:rPr>
-          <w:rFonts w:ascii="Segoe UI" w:hAnsi="Segoe UI" w:eastAsia="Segoe UI" w:cs="Segoe UI"/>
-          <w:noProof w:val="0"/>
-          <w:sz w:val="21"/>
-          <w:szCs w:val="21"/>
-          <w:lang w:val="pt-BR"/>
-        </w:rPr>
-      </w:pPr>
-      <w:r>
-        <w:rPr>
-          <w:rFonts w:ascii="Segoe UI" w:hAnsi="Segoe UI" w:eastAsia="Segoe UI" w:cs="Segoe UI"/>
-          <w:noProof w:val="0"/>
-          <w:sz w:val="21"/>
-          <w:szCs w:val="21"/>
-          <w:lang w:val="pt-BR"/>
-        </w:rPr>
-        <w:t>Centro Mossoró (abaixo do ideal - 13)</w:t>
-      </w:r>
-    </w:p>
-    <w:p>
-      <w:pPr>
-        <w:spacing w:before="210" w:beforeAutospacing="off" w:after="210" w:afterAutospacing="off"/>
-        <w:jc w:val="left"/>
-        <w:rPr>
-          <w:rFonts w:ascii="Segoe UI" w:hAnsi="Segoe UI" w:eastAsia="Segoe UI" w:cs="Segoe UI"/>
-          <w:b w:val="1"/>
-          <w:bCs w:val="1"/>
-          <w:noProof w:val="0"/>
-          <w:sz w:val="21"/>
-          <w:szCs w:val="21"/>
-          <w:lang w:val="pt-BR"/>
-        </w:rPr>
-      </w:pPr>
-      <w:r>
-        <w:rPr>
-          <w:rFonts w:ascii="Segoe UI" w:hAnsi="Segoe UI" w:eastAsia="Segoe UI" w:cs="Segoe UI"/>
-          <w:b w:val="1"/>
-          <w:bCs w:val="1"/>
-          <w:noProof w:val="0"/>
-          <w:sz w:val="21"/>
-          <w:szCs w:val="21"/>
-          <w:lang w:val="pt-BR"/>
-        </w:rPr>
-        <w:t>Analisar os indicadores</w:t>
-      </w:r>
-      <w:r>
-        <w:rPr>
-          <w:rFonts w:ascii="Segoe UI" w:hAnsi="Segoe UI" w:eastAsia="Segoe UI" w:cs="Segoe UI"/>
-          <w:b w:val="1"/>
-          <w:bCs w:val="1"/>
-          <w:noProof w:val="0"/>
-          <w:sz w:val="21"/>
-          <w:szCs w:val="21"/>
-          <w:lang w:val="pt-BR"/>
-        </w:rPr>
-        <w:t>:</w:t>
-      </w:r>
-    </w:p>
-    <w:p>
-      <w:pPr>
-        <w:pStyle w:val="ListParagraph"/>
+        <w:spacing w:after="0"/>
+        <w:rPr>
+          <w:rFonts w:ascii="Segoe UI" w:eastAsia="Segoe UI" w:hAnsi="Segoe UI" w:cs="Segoe UI"/>
+          <w:sz w:val="21"/>
+          <w:szCs w:val="21"/>
+        </w:rPr>
+      </w:pPr>
+      <w:r>
+        <w:rPr>
+          <w:rFonts w:ascii="Segoe UI" w:eastAsia="Segoe UI" w:hAnsi="Segoe UI" w:cs="Segoe UI"/>
+          <w:sz w:val="21"/>
+          <w:szCs w:val="21"/>
+        </w:rPr>
+        <w:t>Entrevistas estruturadas/padronizadas com a gestão (gestores, líderes e auxiliares)</w:t>
+      </w:r>
+    </w:p>
+    <w:p>
+      <w:pPr>
+        <w:pStyle w:val="PargrafodaLista"/>
+        <w:numPr>
+          <w:ilvl w:val="0"/>
+          <w:numId w:val="2"/>
+        </w:numPr>
+        <w:spacing w:after="0"/>
+        <w:rPr>
+          <w:rFonts w:ascii="Segoe UI" w:eastAsia="Segoe UI" w:hAnsi="Segoe UI" w:cs="Segoe UI"/>
+          <w:sz w:val="21"/>
+          <w:szCs w:val="21"/>
+        </w:rPr>
+      </w:pPr>
+      <w:r>
+        <w:rPr>
+          <w:rFonts w:ascii="Segoe UI" w:eastAsia="Segoe UI" w:hAnsi="Segoe UI" w:cs="Segoe UI"/>
+          <w:sz w:val="21"/>
+          <w:szCs w:val="21"/>
+        </w:rPr>
+        <w:t>Cronoanálises</w:t>
+      </w:r>
+    </w:p>
+    <w:p>
+      <w:pPr>
+        <w:pStyle w:val="PargrafodaLista"/>
+        <w:numPr>
+          <w:ilvl w:val="0"/>
+          <w:numId w:val="2"/>
+        </w:numPr>
+        <w:spacing w:after="0"/>
+        <w:rPr>
+          <w:rFonts w:ascii="Segoe UI" w:eastAsia="Segoe UI" w:hAnsi="Segoe UI" w:cs="Segoe UI"/>
+          <w:sz w:val="21"/>
+          <w:szCs w:val="21"/>
+        </w:rPr>
+      </w:pPr>
+      <w:r>
+        <w:rPr>
+          <w:rFonts w:ascii="Segoe UI" w:eastAsia="Segoe UI" w:hAnsi="Segoe UI" w:cs="Segoe UI"/>
+          <w:sz w:val="21"/>
+          <w:szCs w:val="21"/>
+        </w:rPr>
+        <w:t>Metodologias de acompanhamento diário</w:t>
+      </w:r>
+    </w:p>
+    <w:p>
+      <w:pPr>
+        <w:spacing w:before="210" w:after="210"/>
+      </w:pPr>
+      <w:r>
+        <w:rPr>
+          <w:rFonts w:ascii="Segoe UI" w:eastAsia="Segoe UI" w:hAnsi="Segoe UI" w:cs="Segoe UI"/>
+          <w:sz w:val="21"/>
+          <w:szCs w:val="21"/>
+        </w:rPr>
+        <w:t xml:space="preserve"> </w:t>
+      </w:r>
+    </w:p>
+    <w:p>
+      <w:pPr>
+        <w:spacing w:before="210" w:after="210"/>
+      </w:pPr>
+      <w:r>
+        <w:rPr>
+          <w:rFonts w:ascii="Segoe UI" w:eastAsia="Segoe UI" w:hAnsi="Segoe UI" w:cs="Segoe UI"/>
+          <w:b/>
+          <w:bCs/>
+          <w:sz w:val="21"/>
+          <w:szCs w:val="21"/>
+        </w:rPr>
+        <w:t>Estratégias de início:</w:t>
+      </w:r>
+    </w:p>
+    <w:p>
+      <w:pPr>
+        <w:pStyle w:val="PargrafodaLista"/>
         <w:numPr>
           <w:ilvl w:val="0"/>
           <w:numId w:val="1"/>
         </w:numPr>
-        <w:spacing w:before="0" w:beforeAutospacing="off" w:after="0" w:afterAutospacing="off"/>
-        <w:jc w:val="left"/>
-        <w:rPr>
-          <w:rFonts w:ascii="Segoe UI" w:hAnsi="Segoe UI" w:eastAsia="Segoe UI" w:cs="Segoe UI"/>
-          <w:noProof w:val="0"/>
-          <w:sz w:val="21"/>
-          <w:szCs w:val="21"/>
-          <w:lang w:val="pt-BR"/>
-        </w:rPr>
-      </w:pPr>
-      <w:r>
-        <w:rPr>
-          <w:rFonts w:ascii="Segoe UI" w:hAnsi="Segoe UI" w:eastAsia="Segoe UI" w:cs="Segoe UI"/>
-          <w:noProof w:val="0"/>
-          <w:sz w:val="21"/>
-          <w:szCs w:val="21"/>
-          <w:lang w:val="pt-BR"/>
-        </w:rPr>
-        <w:t>Amostras das visitas</w:t>
-      </w:r>
-    </w:p>
-    <w:p>
-      <w:pPr>
-        <w:pStyle w:val="ListParagraph"/>
+        <w:spacing w:after="0"/>
+        <w:rPr>
+          <w:rFonts w:ascii="Segoe UI" w:eastAsia="Segoe UI" w:hAnsi="Segoe UI" w:cs="Segoe UI"/>
+          <w:sz w:val="21"/>
+          <w:szCs w:val="21"/>
+        </w:rPr>
+      </w:pPr>
+      <w:r>
+        <w:rPr>
+          <w:rFonts w:ascii="Segoe UI" w:eastAsia="Segoe UI" w:hAnsi="Segoe UI" w:cs="Segoe UI"/>
+          <w:sz w:val="21"/>
+          <w:szCs w:val="21"/>
+        </w:rPr>
+        <w:t>Consultar BPs para entender realidade da praça</w:t>
+      </w:r>
+    </w:p>
+    <w:p>
+      <w:pPr>
+        <w:pStyle w:val="PargrafodaLista"/>
         <w:numPr>
           <w:ilvl w:val="0"/>
           <w:numId w:val="1"/>
         </w:numPr>
-        <w:spacing w:before="0" w:beforeAutospacing="off" w:after="0" w:afterAutospacing="off"/>
-        <w:jc w:val="left"/>
-        <w:rPr>
-          <w:rFonts w:ascii="Segoe UI" w:hAnsi="Segoe UI" w:eastAsia="Segoe UI" w:cs="Segoe UI"/>
-          <w:noProof w:val="0"/>
-          <w:sz w:val="21"/>
-          <w:szCs w:val="21"/>
-          <w:lang w:val="pt-BR"/>
-        </w:rPr>
-      </w:pPr>
-      <w:r>
-        <w:rPr>
-          <w:rFonts w:ascii="Segoe UI" w:hAnsi="Segoe UI" w:eastAsia="Segoe UI" w:cs="Segoe UI"/>
-          <w:noProof w:val="0"/>
-          <w:sz w:val="21"/>
-          <w:szCs w:val="21"/>
-          <w:lang w:val="pt-BR"/>
-        </w:rPr>
-        <w:t>Estrutura, dias e horas operacionais</w:t>
-      </w:r>
-    </w:p>
-    <w:p>
-      <w:pPr>
-        <w:pStyle w:val="ListParagraph"/>
+        <w:spacing w:after="0"/>
+        <w:rPr>
+          <w:rFonts w:ascii="Segoe UI" w:eastAsia="Segoe UI" w:hAnsi="Segoe UI" w:cs="Segoe UI"/>
+          <w:sz w:val="21"/>
+          <w:szCs w:val="21"/>
+        </w:rPr>
+      </w:pPr>
+      <w:r>
+        <w:rPr>
+          <w:rFonts w:ascii="Segoe UI" w:eastAsia="Segoe UI" w:hAnsi="Segoe UI" w:cs="Segoe UI"/>
+          <w:sz w:val="21"/>
+          <w:szCs w:val="21"/>
+        </w:rPr>
+        <w:t>Potencial do piloto rodar em paralelo com arquitetura organizacional (na Nevaldo especificamente)</w:t>
+      </w:r>
+    </w:p>
+    <w:p>
+      <w:pPr>
+        <w:pStyle w:val="PargrafodaLista"/>
         <w:numPr>
           <w:ilvl w:val="0"/>
           <w:numId w:val="1"/>
         </w:numPr>
-        <w:spacing w:before="0" w:beforeAutospacing="off" w:after="0" w:afterAutospacing="off"/>
-        <w:jc w:val="left"/>
-        <w:rPr>
-          <w:rFonts w:ascii="Segoe UI" w:hAnsi="Segoe UI" w:eastAsia="Segoe UI" w:cs="Segoe UI"/>
-          <w:noProof w:val="0"/>
-          <w:sz w:val="21"/>
-          <w:szCs w:val="21"/>
-          <w:lang w:val="pt-BR"/>
-        </w:rPr>
-      </w:pPr>
-      <w:r>
-        <w:rPr>
-          <w:rFonts w:ascii="Segoe UI" w:hAnsi="Segoe UI" w:eastAsia="Segoe UI" w:cs="Segoe UI"/>
-          <w:noProof w:val="0"/>
-          <w:sz w:val="21"/>
-          <w:szCs w:val="21"/>
-          <w:lang w:val="pt-BR"/>
-        </w:rPr>
-        <w:t xml:space="preserve">Pessoas: </w:t>
-      </w:r>
-      <w:r>
-        <w:rPr>
-          <w:rFonts w:ascii="Segoe UI" w:hAnsi="Segoe UI" w:eastAsia="Segoe UI" w:cs="Segoe UI"/>
-          <w:noProof w:val="0"/>
-          <w:sz w:val="21"/>
-          <w:szCs w:val="21"/>
-          <w:lang w:val="pt-BR"/>
-        </w:rPr>
-        <w:t>Quantidade</w:t>
-      </w:r>
-      <w:r>
-        <w:rPr>
-          <w:rFonts w:ascii="Segoe UI" w:hAnsi="Segoe UI" w:eastAsia="Segoe UI" w:cs="Segoe UI"/>
-          <w:noProof w:val="0"/>
-          <w:sz w:val="21"/>
-          <w:szCs w:val="21"/>
-          <w:lang w:val="pt-BR"/>
-        </w:rPr>
-        <w:t xml:space="preserve">, </w:t>
-      </w:r>
-      <w:r>
-        <w:rPr>
-          <w:rFonts w:ascii="Segoe UI" w:hAnsi="Segoe UI" w:eastAsia="Segoe UI" w:cs="Segoe UI"/>
-          <w:noProof w:val="0"/>
-          <w:sz w:val="21"/>
-          <w:szCs w:val="21"/>
-          <w:lang w:val="pt-BR"/>
-        </w:rPr>
-        <w:t>absenteísmo</w:t>
-      </w:r>
-      <w:r>
-        <w:rPr>
-          <w:rFonts w:ascii="Segoe UI" w:hAnsi="Segoe UI" w:eastAsia="Segoe UI" w:cs="Segoe UI"/>
-          <w:noProof w:val="0"/>
-          <w:sz w:val="21"/>
-          <w:szCs w:val="21"/>
-          <w:lang w:val="pt-BR"/>
-        </w:rPr>
-        <w:t>, horas extra, atestado, rotatividade, tempo médio de casa</w:t>
-      </w:r>
-    </w:p>
-    <w:p>
-      <w:pPr>
-        <w:pStyle w:val="ListParagraph"/>
+        <w:spacing w:after="0"/>
+        <w:rPr>
+          <w:rFonts w:ascii="Segoe UI" w:eastAsia="Segoe UI" w:hAnsi="Segoe UI" w:cs="Segoe UI"/>
+          <w:sz w:val="21"/>
+          <w:szCs w:val="21"/>
+        </w:rPr>
+      </w:pPr>
+      <w:r>
+        <w:rPr>
+          <w:rFonts w:ascii="Segoe UI" w:eastAsia="Segoe UI" w:hAnsi="Segoe UI" w:cs="Segoe UI"/>
+          <w:sz w:val="21"/>
+          <w:szCs w:val="21"/>
+        </w:rPr>
+        <w:t>Entender abordagem e validar com Fabiana (segunda)</w:t>
+      </w:r>
+    </w:p>
+    <w:p>
+      <w:pPr>
+        <w:pStyle w:val="PargrafodaLista"/>
         <w:numPr>
           <w:ilvl w:val="0"/>
           <w:numId w:val="1"/>
         </w:numPr>
-        <w:spacing w:before="0" w:beforeAutospacing="off" w:after="0" w:afterAutospacing="off"/>
-        <w:jc w:val="left"/>
-        <w:rPr>
-          <w:rFonts w:ascii="Segoe UI" w:hAnsi="Segoe UI" w:eastAsia="Segoe UI" w:cs="Segoe UI"/>
-          <w:noProof w:val="0"/>
-          <w:sz w:val="21"/>
-          <w:szCs w:val="21"/>
-          <w:lang w:val="pt-BR"/>
-        </w:rPr>
-      </w:pPr>
-      <w:r>
-        <w:rPr>
-          <w:rFonts w:ascii="Segoe UI" w:hAnsi="Segoe UI" w:eastAsia="Segoe UI" w:cs="Segoe UI"/>
-          <w:noProof w:val="0"/>
-          <w:sz w:val="21"/>
-          <w:szCs w:val="21"/>
-          <w:lang w:val="pt-BR"/>
-        </w:rPr>
-        <w:t>Faturamento (vendas e itens)</w:t>
-      </w:r>
-    </w:p>
-    <w:p>
-      <w:pPr>
-        <w:pStyle w:val="ListParagraph"/>
-        <w:numPr>
-          <w:ilvl w:val="0"/>
-          <w:numId w:val="1"/>
-        </w:numPr>
-        <w:spacing w:before="0" w:beforeAutospacing="off" w:after="0" w:afterAutospacing="off"/>
-        <w:jc w:val="left"/>
-        <w:rPr>
-          <w:rFonts w:ascii="Segoe UI" w:hAnsi="Segoe UI" w:eastAsia="Segoe UI" w:cs="Segoe UI"/>
-          <w:noProof w:val="0"/>
-          <w:sz w:val="21"/>
-          <w:szCs w:val="21"/>
-          <w:lang w:val="pt-BR"/>
-        </w:rPr>
-      </w:pPr>
-      <w:r>
-        <w:rPr>
-          <w:rFonts w:ascii="Segoe UI" w:hAnsi="Segoe UI" w:eastAsia="Segoe UI" w:cs="Segoe UI"/>
-          <w:noProof w:val="0"/>
-          <w:sz w:val="21"/>
-          <w:szCs w:val="21"/>
-          <w:lang w:val="pt-BR"/>
-        </w:rPr>
-        <w:t>Indicadores: base total, ativa, inícios, pedidos</w:t>
-      </w:r>
-    </w:p>
-    <w:p>
-      <w:pPr>
-        <w:pStyle w:val="ListParagraph"/>
-        <w:numPr>
-          <w:ilvl w:val="0"/>
-          <w:numId w:val="1"/>
-        </w:numPr>
-        <w:spacing w:before="0" w:beforeAutospacing="off" w:after="0" w:afterAutospacing="off"/>
-        <w:jc w:val="left"/>
-        <w:rPr>
-          <w:rFonts w:ascii="Segoe UI" w:hAnsi="Segoe UI" w:eastAsia="Segoe UI" w:cs="Segoe UI"/>
-          <w:noProof w:val="0"/>
-          <w:sz w:val="21"/>
-          <w:szCs w:val="21"/>
-          <w:lang w:val="pt-BR"/>
-        </w:rPr>
-      </w:pPr>
-      <w:r>
-        <w:rPr>
-          <w:rFonts w:ascii="Segoe UI" w:hAnsi="Segoe UI" w:eastAsia="Segoe UI" w:cs="Segoe UI"/>
-          <w:noProof w:val="0"/>
-          <w:sz w:val="21"/>
-          <w:szCs w:val="21"/>
-          <w:lang w:val="pt-BR"/>
-        </w:rPr>
-        <w:t>Horas produtivas/horas totais</w:t>
-      </w:r>
-    </w:p>
-    <w:p>
-      <w:pPr>
-        <w:pStyle w:val="ListParagraph"/>
-        <w:numPr>
-          <w:ilvl w:val="0"/>
-          <w:numId w:val="1"/>
-        </w:numPr>
-        <w:spacing w:before="0" w:beforeAutospacing="off" w:after="0" w:afterAutospacing="off"/>
-        <w:jc w:val="left"/>
-        <w:rPr>
-          <w:rFonts w:ascii="Segoe UI" w:hAnsi="Segoe UI" w:eastAsia="Segoe UI" w:cs="Segoe UI"/>
-          <w:noProof w:val="0"/>
-          <w:sz w:val="21"/>
-          <w:szCs w:val="21"/>
-          <w:lang w:val="pt-BR"/>
-        </w:rPr>
-      </w:pPr>
-      <w:r>
-        <w:rPr>
-          <w:rFonts w:ascii="Segoe UI" w:hAnsi="Segoe UI" w:eastAsia="Segoe UI" w:cs="Segoe UI"/>
-          <w:noProof w:val="0"/>
-          <w:sz w:val="21"/>
-          <w:szCs w:val="21"/>
-          <w:lang w:val="pt-BR"/>
-        </w:rPr>
-        <w:t>Pessoas por faixa de fluxo (baixo/médio/alto)</w:t>
-      </w:r>
-    </w:p>
-    <w:p>
-      <w:pPr>
-        <w:pStyle w:val="ListParagraph"/>
-        <w:numPr>
-          <w:ilvl w:val="0"/>
-          <w:numId w:val="1"/>
-        </w:numPr>
-        <w:spacing w:before="0" w:beforeAutospacing="off" w:after="0" w:afterAutospacing="off"/>
-        <w:jc w:val="left"/>
-        <w:rPr>
-          <w:rFonts w:ascii="Segoe UI" w:hAnsi="Segoe UI" w:eastAsia="Segoe UI" w:cs="Segoe UI"/>
-          <w:noProof w:val="0"/>
-          <w:sz w:val="21"/>
-          <w:szCs w:val="21"/>
-          <w:lang w:val="pt-BR"/>
-        </w:rPr>
-      </w:pPr>
-      <w:r>
-        <w:rPr>
-          <w:rFonts w:ascii="Segoe UI" w:hAnsi="Segoe UI" w:eastAsia="Segoe UI" w:cs="Segoe UI"/>
-          <w:noProof w:val="0"/>
-          <w:sz w:val="21"/>
-          <w:szCs w:val="21"/>
-          <w:lang w:val="pt-BR"/>
-        </w:rPr>
-        <w:t xml:space="preserve">Nº de pessoas na mesma </w:t>
-      </w:r>
-      <w:r>
-        <w:rPr>
-          <w:rFonts w:ascii="Segoe UI" w:hAnsi="Segoe UI" w:eastAsia="Segoe UI" w:cs="Segoe UI"/>
-          <w:noProof w:val="0"/>
-          <w:sz w:val="21"/>
-          <w:szCs w:val="21"/>
-          <w:lang w:val="pt-BR"/>
-        </w:rPr>
-        <w:t>atividade sem</w:t>
-      </w:r>
-      <w:r>
-        <w:rPr>
-          <w:rFonts w:ascii="Segoe UI" w:hAnsi="Segoe UI" w:eastAsia="Segoe UI" w:cs="Segoe UI"/>
-          <w:noProof w:val="0"/>
-          <w:sz w:val="21"/>
-          <w:szCs w:val="21"/>
-          <w:lang w:val="pt-BR"/>
-        </w:rPr>
-        <w:t xml:space="preserve"> necessidade </w:t>
-      </w:r>
-    </w:p>
-    <w:p>
-      <w:pPr>
-        <w:pStyle w:val="ListParagraph"/>
-        <w:numPr>
-          <w:ilvl w:val="0"/>
-          <w:numId w:val="1"/>
-        </w:numPr>
-        <w:spacing w:before="0" w:beforeAutospacing="off" w:after="0" w:afterAutospacing="off"/>
-        <w:jc w:val="left"/>
-        <w:rPr>
-          <w:rFonts w:ascii="Segoe UI" w:hAnsi="Segoe UI" w:eastAsia="Segoe UI" w:cs="Segoe UI"/>
-          <w:noProof w:val="0"/>
-          <w:sz w:val="21"/>
-          <w:szCs w:val="21"/>
-          <w:lang w:val="pt-BR"/>
-        </w:rPr>
-      </w:pPr>
-      <w:r>
-        <w:rPr>
-          <w:rFonts w:ascii="Segoe UI" w:hAnsi="Segoe UI" w:eastAsia="Segoe UI" w:cs="Segoe UI"/>
-          <w:noProof w:val="0"/>
-          <w:sz w:val="21"/>
-          <w:szCs w:val="21"/>
-          <w:lang w:val="pt-BR"/>
-        </w:rPr>
-        <w:t>Atividades de baixo valor percebido</w:t>
-      </w:r>
-      <w:r>
-        <w:rPr>
-          <w:rFonts w:ascii="Segoe UI" w:hAnsi="Segoe UI" w:eastAsia="Segoe UI" w:cs="Segoe UI"/>
-          <w:noProof w:val="0"/>
-          <w:sz w:val="21"/>
-          <w:szCs w:val="21"/>
-          <w:lang w:val="pt-BR"/>
-        </w:rPr>
-        <w:t xml:space="preserve"> e tempo dedicado</w:t>
-      </w:r>
-    </w:p>
-    <w:p>
-      <w:pPr>
-        <w:pStyle w:val="ListParagraph"/>
-        <w:numPr>
-          <w:ilvl w:val="0"/>
-          <w:numId w:val="1"/>
-        </w:numPr>
-        <w:spacing w:before="0" w:beforeAutospacing="off" w:after="0" w:afterAutospacing="off"/>
-        <w:jc w:val="left"/>
-        <w:rPr/>
-      </w:pPr>
-      <w:r>
-        <w:rPr/>
-        <w:t>Acredito que podemos fazer avaliação de indicadores tipo:</w:t>
-      </w:r>
-    </w:p>
-    <w:p>
-      <w:pPr>
-        <w:spacing w:before="210" w:beforeAutospacing="off" w:after="210" w:afterAutospacing="off"/>
-        <w:jc w:val="left"/>
-      </w:pPr>
-      <w:r>
-        <w:rPr>
-          <w:rFonts w:ascii="Segoe UI" w:hAnsi="Segoe UI" w:eastAsia="Segoe UI" w:cs="Segoe UI"/>
-          <w:noProof w:val="0"/>
-          <w:sz w:val="21"/>
-          <w:szCs w:val="21"/>
-          <w:lang w:val="pt-BR"/>
+        <w:spacing w:after="0"/>
+        <w:rPr>
+          <w:rFonts w:ascii="Segoe UI" w:eastAsia="Segoe UI" w:hAnsi="Segoe UI" w:cs="Segoe UI"/>
+          <w:sz w:val="21"/>
+          <w:szCs w:val="21"/>
+        </w:rPr>
+      </w:pPr>
+      <w:r>
+        <w:rPr>
+          <w:rFonts w:ascii="Segoe UI" w:eastAsia="Segoe UI" w:hAnsi="Segoe UI" w:cs="Segoe UI"/>
+          <w:sz w:val="21"/>
+          <w:szCs w:val="21"/>
+        </w:rPr>
+        <w:t>Montar painel de acompanhamento das praças piloto.</w:t>
+      </w:r>
+    </w:p>
+    <w:p>
+      <w:r>
+        <w:rPr>
+          <w:rFonts w:ascii="Segoe UI" w:eastAsia="Segoe UI" w:hAnsi="Segoe UI" w:cs="Segoe UI"/>
+          <w:sz w:val="21"/>
+          <w:szCs w:val="21"/>
         </w:rPr>
         <w:t xml:space="preserve"> </w:t>
       </w:r>
-    </w:p>
-    <w:p>
-      <w:pPr>
-        <w:spacing w:before="210" w:beforeAutospacing="off" w:after="210" w:afterAutospacing="off"/>
-        <w:jc w:val="left"/>
-      </w:pPr>
-      <w:r>
-        <w:rPr>
-          <w:rFonts w:ascii="Segoe UI" w:hAnsi="Segoe UI" w:eastAsia="Segoe UI" w:cs="Segoe UI"/>
-          <w:b w:val="1"/>
-          <w:bCs w:val="1"/>
-          <w:noProof w:val="0"/>
-          <w:sz w:val="21"/>
-          <w:szCs w:val="21"/>
-          <w:lang w:val="pt-BR"/>
-        </w:rPr>
-        <w:t>Sugestões:</w:t>
-      </w:r>
-    </w:p>
-    <w:p>
-      <w:pPr>
-        <w:pStyle w:val="ListParagraph"/>
-        <w:numPr>
-          <w:ilvl w:val="0"/>
-          <w:numId w:val="3"/>
-        </w:numPr>
-        <w:spacing w:before="0" w:beforeAutospacing="off" w:after="0" w:afterAutospacing="off"/>
-        <w:jc w:val="left"/>
-        <w:rPr>
-          <w:rFonts w:ascii="Segoe UI" w:hAnsi="Segoe UI" w:eastAsia="Segoe UI" w:cs="Segoe UI"/>
-          <w:noProof w:val="0"/>
-          <w:sz w:val="21"/>
-          <w:szCs w:val="21"/>
-          <w:lang w:val="pt-BR"/>
-        </w:rPr>
-      </w:pPr>
-      <w:r>
-        <w:rPr>
-          <w:rFonts w:ascii="Segoe UI" w:hAnsi="Segoe UI" w:eastAsia="Segoe UI" w:cs="Segoe UI"/>
-          <w:noProof w:val="0"/>
-          <w:sz w:val="21"/>
-          <w:szCs w:val="21"/>
-          <w:lang w:val="pt-BR"/>
-        </w:rPr>
-        <w:t>Definir parâmetros de análise (avaliar e acompanhar indicadores chaves e de capacidade produtiva)</w:t>
-      </w:r>
-    </w:p>
-    <w:p>
-      <w:pPr>
-        <w:pStyle w:val="ListParagraph"/>
-        <w:numPr>
-          <w:ilvl w:val="0"/>
-          <w:numId w:val="3"/>
-        </w:numPr>
-        <w:spacing w:before="0" w:beforeAutospacing="off" w:after="0" w:afterAutospacing="off"/>
-        <w:jc w:val="left"/>
-        <w:rPr>
-          <w:rFonts w:ascii="Segoe UI" w:hAnsi="Segoe UI" w:eastAsia="Segoe UI" w:cs="Segoe UI"/>
-          <w:noProof w:val="0"/>
-          <w:sz w:val="21"/>
-          <w:szCs w:val="21"/>
-          <w:lang w:val="pt-BR"/>
-        </w:rPr>
-      </w:pPr>
-      <w:r>
-        <w:rPr>
-          <w:rFonts w:ascii="Segoe UI" w:hAnsi="Segoe UI" w:eastAsia="Segoe UI" w:cs="Segoe UI"/>
-          <w:noProof w:val="0"/>
-          <w:sz w:val="21"/>
-          <w:szCs w:val="21"/>
-          <w:lang w:val="pt-BR"/>
-        </w:rPr>
-        <w:t>Entrevistas estruturadas/padronizadas com a gestão (gestores, líderes e auxiliares)</w:t>
-      </w:r>
-    </w:p>
-    <w:p>
-      <w:pPr>
-        <w:pStyle w:val="ListParagraph"/>
-        <w:numPr>
-          <w:ilvl w:val="0"/>
-          <w:numId w:val="3"/>
-        </w:numPr>
-        <w:spacing w:before="0" w:beforeAutospacing="off" w:after="0" w:afterAutospacing="off"/>
-        <w:jc w:val="left"/>
-        <w:rPr>
-          <w:rFonts w:ascii="Segoe UI" w:hAnsi="Segoe UI" w:eastAsia="Segoe UI" w:cs="Segoe UI"/>
-          <w:noProof w:val="0"/>
-          <w:sz w:val="21"/>
-          <w:szCs w:val="21"/>
-          <w:lang w:val="pt-BR"/>
-        </w:rPr>
-      </w:pPr>
-      <w:r>
-        <w:rPr>
-          <w:rFonts w:ascii="Segoe UI" w:hAnsi="Segoe UI" w:eastAsia="Segoe UI" w:cs="Segoe UI"/>
-          <w:noProof w:val="0"/>
-          <w:sz w:val="21"/>
-          <w:szCs w:val="21"/>
-          <w:lang w:val="pt-BR"/>
-        </w:rPr>
-        <w:t>Cronoanálises</w:t>
-      </w:r>
-    </w:p>
-    <w:p>
-      <w:pPr>
-        <w:pStyle w:val="ListParagraph"/>
-        <w:numPr>
-          <w:ilvl w:val="0"/>
-          <w:numId w:val="3"/>
-        </w:numPr>
-        <w:spacing w:before="0" w:beforeAutospacing="off" w:after="0" w:afterAutospacing="off"/>
-        <w:jc w:val="left"/>
-        <w:rPr>
-          <w:rFonts w:ascii="Segoe UI" w:hAnsi="Segoe UI" w:eastAsia="Segoe UI" w:cs="Segoe UI"/>
-          <w:noProof w:val="0"/>
-          <w:sz w:val="21"/>
-          <w:szCs w:val="21"/>
-          <w:lang w:val="pt-BR"/>
-        </w:rPr>
-      </w:pPr>
-      <w:r>
-        <w:rPr>
-          <w:rFonts w:ascii="Segoe UI" w:hAnsi="Segoe UI" w:eastAsia="Segoe UI" w:cs="Segoe UI"/>
-          <w:noProof w:val="0"/>
-          <w:sz w:val="21"/>
-          <w:szCs w:val="21"/>
-          <w:lang w:val="pt-BR"/>
-        </w:rPr>
-        <w:t>Metodologias de acompanhamento diário</w:t>
-      </w:r>
-    </w:p>
-    <w:p>
-      <w:pPr>
-        <w:spacing w:before="210" w:beforeAutospacing="off" w:after="210" w:afterAutospacing="off"/>
-        <w:jc w:val="left"/>
-      </w:pPr>
-      <w:r>
-        <w:rPr>
-          <w:rFonts w:ascii="Segoe UI" w:hAnsi="Segoe UI" w:eastAsia="Segoe UI" w:cs="Segoe UI"/>
-          <w:noProof w:val="0"/>
-          <w:sz w:val="21"/>
-          <w:szCs w:val="21"/>
-          <w:lang w:val="pt-BR"/>
+      <w:r>
+        <w:rPr>
+          <w:rFonts w:ascii="Arial Nova" w:eastAsia="Arial Nova" w:hAnsi="Arial Nova" w:cs="Arial Nova"/>
         </w:rPr>
         <w:t xml:space="preserve"> </w:t>
       </w:r>
     </w:p>
-    <w:p>
-      <w:pPr>
-        <w:spacing w:before="210" w:beforeAutospacing="off" w:after="210" w:afterAutospacing="off"/>
-        <w:jc w:val="left"/>
-      </w:pPr>
-      <w:r>
-        <w:rPr>
-          <w:rFonts w:ascii="Segoe UI" w:hAnsi="Segoe UI" w:eastAsia="Segoe UI" w:cs="Segoe UI"/>
-          <w:b w:val="1"/>
-          <w:bCs w:val="1"/>
-          <w:noProof w:val="0"/>
-          <w:sz w:val="21"/>
-          <w:szCs w:val="21"/>
-          <w:lang w:val="pt-BR"/>
-        </w:rPr>
-        <w:t>Estratégias de início:</w:t>
-      </w:r>
-    </w:p>
-    <w:p>
-      <w:pPr>
-        <w:pStyle w:val="ListParagraph"/>
-        <w:numPr>
-          <w:ilvl w:val="0"/>
-          <w:numId w:val="4"/>
-        </w:numPr>
-        <w:spacing w:before="0" w:beforeAutospacing="off" w:after="0" w:afterAutospacing="off"/>
-        <w:jc w:val="left"/>
-        <w:rPr>
-          <w:rFonts w:ascii="Segoe UI" w:hAnsi="Segoe UI" w:eastAsia="Segoe UI" w:cs="Segoe UI"/>
-          <w:noProof w:val="0"/>
-          <w:sz w:val="21"/>
-          <w:szCs w:val="21"/>
-          <w:lang w:val="pt-BR"/>
-        </w:rPr>
-      </w:pPr>
-      <w:r>
-        <w:rPr>
-          <w:rFonts w:ascii="Segoe UI" w:hAnsi="Segoe UI" w:eastAsia="Segoe UI" w:cs="Segoe UI"/>
-          <w:noProof w:val="0"/>
-          <w:sz w:val="21"/>
-          <w:szCs w:val="21"/>
-          <w:lang w:val="pt-BR"/>
-        </w:rPr>
-        <w:t>Consultar BPs para entender realidade da praça</w:t>
-      </w:r>
-    </w:p>
-    <w:p>
-      <w:pPr>
-        <w:pStyle w:val="ListParagraph"/>
-        <w:numPr>
-          <w:ilvl w:val="0"/>
-          <w:numId w:val="4"/>
-        </w:numPr>
-        <w:spacing w:before="0" w:beforeAutospacing="off" w:after="0" w:afterAutospacing="off"/>
-        <w:jc w:val="left"/>
-        <w:rPr>
-          <w:rFonts w:ascii="Segoe UI" w:hAnsi="Segoe UI" w:eastAsia="Segoe UI" w:cs="Segoe UI"/>
-          <w:noProof w:val="0"/>
-          <w:sz w:val="21"/>
-          <w:szCs w:val="21"/>
-          <w:lang w:val="pt-BR"/>
-        </w:rPr>
-      </w:pPr>
-      <w:r>
-        <w:rPr>
-          <w:rFonts w:ascii="Segoe UI" w:hAnsi="Segoe UI" w:eastAsia="Segoe UI" w:cs="Segoe UI"/>
-          <w:noProof w:val="0"/>
-          <w:sz w:val="21"/>
-          <w:szCs w:val="21"/>
-          <w:lang w:val="pt-BR"/>
-        </w:rPr>
-        <w:t>Potencial do piloto rodar em paralelo com arquitetura organizacional (na Nevaldo especificamente)</w:t>
-      </w:r>
-    </w:p>
-    <w:p>
-      <w:pPr>
-        <w:pStyle w:val="ListParagraph"/>
-        <w:numPr>
-          <w:ilvl w:val="0"/>
-          <w:numId w:val="4"/>
-        </w:numPr>
-        <w:spacing w:before="0" w:beforeAutospacing="off" w:after="0" w:afterAutospacing="off"/>
-        <w:jc w:val="left"/>
-        <w:rPr>
-          <w:rFonts w:ascii="Segoe UI" w:hAnsi="Segoe UI" w:eastAsia="Segoe UI" w:cs="Segoe UI"/>
-          <w:noProof w:val="0"/>
-          <w:sz w:val="21"/>
-          <w:szCs w:val="21"/>
-          <w:lang w:val="pt-BR"/>
-        </w:rPr>
-      </w:pPr>
-      <w:r>
-        <w:rPr>
-          <w:rFonts w:ascii="Segoe UI" w:hAnsi="Segoe UI" w:eastAsia="Segoe UI" w:cs="Segoe UI"/>
-          <w:noProof w:val="0"/>
-          <w:sz w:val="21"/>
-          <w:szCs w:val="21"/>
-          <w:lang w:val="pt-BR"/>
-        </w:rPr>
-        <w:t>Entender abordagem e validar com Fabiana (segunda)</w:t>
-      </w:r>
-    </w:p>
-    <w:p>
-      <w:pPr>
-        <w:pStyle w:val="ListParagraph"/>
-        <w:numPr>
-          <w:ilvl w:val="0"/>
-          <w:numId w:val="4"/>
-        </w:numPr>
-        <w:spacing w:before="0" w:beforeAutospacing="off" w:after="0" w:afterAutospacing="off"/>
-        <w:jc w:val="left"/>
-        <w:rPr>
-          <w:rFonts w:ascii="Segoe UI" w:hAnsi="Segoe UI" w:eastAsia="Segoe UI" w:cs="Segoe UI"/>
-          <w:noProof w:val="0"/>
-          <w:sz w:val="21"/>
-          <w:szCs w:val="21"/>
-          <w:lang w:val="pt-BR"/>
-        </w:rPr>
-      </w:pPr>
-      <w:r>
-        <w:rPr>
-          <w:rFonts w:ascii="Segoe UI" w:hAnsi="Segoe UI" w:eastAsia="Segoe UI" w:cs="Segoe UI"/>
-          <w:noProof w:val="0"/>
-          <w:sz w:val="21"/>
-          <w:szCs w:val="21"/>
-          <w:lang w:val="pt-BR"/>
-        </w:rPr>
-        <w:t>Montar painel de acompanhamento das praças piloto.</w:t>
-      </w:r>
-    </w:p>
-    <w:p>
-      <w:pPr>
-        <w:pStyle w:val="Normal"/>
-        <w:jc w:val="left"/>
-      </w:pPr>
-      <w:r>
-        <w:rPr>
-          <w:rFonts w:ascii="Segoe UI" w:hAnsi="Segoe UI" w:eastAsia="Segoe UI" w:cs="Segoe UI"/>
-          <w:noProof w:val="0"/>
-          <w:sz w:val="21"/>
-          <w:szCs w:val="21"/>
-          <w:lang w:val="pt-BR"/>
-        </w:rPr>
-        <w:t xml:space="preserve"> </w:t>
-      </w:r>
-      <w:r>
-        <w:rPr>
-          <w:rFonts w:ascii="Arial Nova" w:hAnsi="Arial Nova" w:eastAsia="Arial Nova" w:cs="Arial Nova"/>
-          <w:noProof w:val="0"/>
-          <w:sz w:val="24"/>
-          <w:szCs w:val="24"/>
-          <w:lang w:val="pt-BR"/>
-        </w:rPr>
-        <w:t xml:space="preserve"> </w:t>
-      </w:r>
-    </w:p>
     <w:sectPr>
-      <w:pgSz w:w="11906" w:h="16838" w:orient="portrait"/>
+      <w:pgSz w:w="11906" w:h="16838"/>
       <w:pgMar w:top="1440" w:right="1440" w:bottom="1440" w:left="1440" w:header="720" w:footer="720" w:gutter="0"/>
       <w:cols w:space="720"/>
       <w:docGrid w:linePitch="360"/>
@@ -804,11 +659,12 @@
 </file>
 
 <file path=word/numbering.xml><?xml version="1.0" encoding="utf-8"?>
-<w:numbering xmlns:w="http://schemas.openxmlformats.org/wordprocessingml/2006/main">
-  <w:abstractNum xmlns:w="http://schemas.openxmlformats.org/wordprocessingml/2006/main" w:abstractNumId="4">
-    <w:nsid w:val="3dc38ba8"/>
-    <w:multiLevelType xmlns:w="http://schemas.openxmlformats.org/wordprocessingml/2006/main" w:val="hybridMultilevel"/>
-    <w:lvl xmlns:w="http://schemas.openxmlformats.org/wordprocessingml/2006/main" w:ilvl="0">
+<w:numbering xmlns:wpc="http://schemas.microsoft.com/office/word/2010/wordprocessingCanvas" xmlns:cx="http://schemas.microsoft.com/office/drawing/2014/chartex" xmlns:cx1="http://schemas.microsoft.com/office/drawing/2015/9/8/chartex" xmlns:cx2="http://schemas.microsoft.com/office/drawing/2015/10/21/chartex" xmlns:cx3="http://schemas.microsoft.com/office/drawing/2016/5/9/chartex" xmlns:cx4="http://schemas.microsoft.com/office/drawing/2016/5/10/chartex" xmlns:cx5="http://schemas.microsoft.com/office/drawing/2016/5/11/chartex" xmlns:cx6="http://schemas.microsoft.com/office/drawing/2016/5/12/chartex" xmlns:cx7="http://schemas.microsoft.com/office/drawing/2016/5/13/chartex" xmlns:cx8="http://schemas.microsoft.com/office/drawing/2016/5/14/chartex" xmlns:mc="http://schemas.openxmlformats.org/markup-compatibility/2006" xmlns:aink="http://schemas.microsoft.com/office/drawing/2016/ink" xmlns:am3d="http://schemas.microsoft.com/office/drawing/2017/model3d" xmlns:o="urn:schemas-microsoft-com:office:office" xmlns:oel="http://schemas.microsoft.com/office/2019/extlst" xmlns:r="http://schemas.openxmlformats.org/officeDocument/2006/relationships" xmlns:m="http://schemas.openxmlformats.org/officeDocument/2006/math" xmlns:v="urn:schemas-microsoft-com:vml" xmlns:wp14="http://schemas.microsoft.com/office/word/2010/wordprocessingDrawing" xmlns:wp="http://schemas.openxmlformats.org/drawingml/2006/wordprocessingDrawing" xmlns:w10="urn:schemas-microsoft-com:office:word" xmlns:w="http://schemas.openxmlformats.org/wordprocessingml/2006/main" xmlns:w14="http://schemas.microsoft.com/office/word/2010/wordml" xmlns:w15="http://schemas.microsoft.com/office/word/2012/wordml" xmlns:w16cex="http://schemas.microsoft.com/office/word/2018/wordml/cex" xmlns:w16cid="http://schemas.microsoft.com/office/word/2016/wordml/cid" xmlns:w16="http://schemas.microsoft.com/office/word/2018/wordml" xmlns:w16du="http://schemas.microsoft.com/office/word/2023/wordml/word16du" xmlns:w16sdtdh="http://schemas.microsoft.com/office/word/2020/wordml/sdtdatahash" xmlns:w16sdtfl="http://schemas.microsoft.com/office/word/2024/wordml/sdtformatlock" xmlns:w16se="http://schemas.microsoft.com/office/word/2015/wordml/symex" xmlns:wpg="http://schemas.microsoft.com/office/word/2010/wordprocessingGroup" xmlns:wpi="http://schemas.microsoft.com/office/word/2010/wordprocessingInk" xmlns:wne="http://schemas.microsoft.com/office/word/2006/wordml" xmlns:wps="http://schemas.microsoft.com/office/word/2010/wordprocessingShape" mc:Ignorable="w14 w15 w16se w16cid w16 w16cex w16sdtdh w16sdtfl w16du wp14">
+  <w:abstractNum w:abstractNumId="0" w15:restartNumberingAfterBreak="0">
+    <w:nsid w:val="17EB1ADF"/>
+    <w:multiLevelType w:val="hybridMultilevel"/>
+    <w:tmpl w:val="8054AB42"/>
+    <w:lvl w:ilvl="0" w:tplc="96CEF670">
       <w:start w:val="1"/>
       <w:numFmt w:val="decimal"/>
       <w:lvlText w:val="%1."/>
@@ -817,7 +673,7 @@
         <w:ind w:left="720" w:hanging="360"/>
       </w:pPr>
     </w:lvl>
-    <w:lvl xmlns:w="http://schemas.openxmlformats.org/wordprocessingml/2006/main" w:ilvl="1">
+    <w:lvl w:ilvl="1" w:tplc="E1C86618">
       <w:start w:val="1"/>
       <w:numFmt w:val="lowerLetter"/>
       <w:lvlText w:val="%2."/>
@@ -826,7 +682,7 @@
         <w:ind w:left="1440" w:hanging="360"/>
       </w:pPr>
     </w:lvl>
-    <w:lvl xmlns:w="http://schemas.openxmlformats.org/wordprocessingml/2006/main" w:ilvl="2">
+    <w:lvl w:ilvl="2" w:tplc="328EC086">
       <w:start w:val="1"/>
       <w:numFmt w:val="lowerRoman"/>
       <w:lvlText w:val="%3."/>
@@ -835,7 +691,7 @@
         <w:ind w:left="2160" w:hanging="180"/>
       </w:pPr>
     </w:lvl>
-    <w:lvl xmlns:w="http://schemas.openxmlformats.org/wordprocessingml/2006/main" w:ilvl="3">
+    <w:lvl w:ilvl="3" w:tplc="7C6E1D5A">
       <w:start w:val="1"/>
       <w:numFmt w:val="decimal"/>
       <w:lvlText w:val="%4."/>
@@ -844,7 +700,7 @@
         <w:ind w:left="2880" w:hanging="360"/>
       </w:pPr>
     </w:lvl>
-    <w:lvl xmlns:w="http://schemas.openxmlformats.org/wordprocessingml/2006/main" w:ilvl="4">
+    <w:lvl w:ilvl="4" w:tplc="6ED6A74E">
       <w:start w:val="1"/>
       <w:numFmt w:val="lowerLetter"/>
       <w:lvlText w:val="%5."/>
@@ -853,7 +709,7 @@
         <w:ind w:left="3600" w:hanging="360"/>
       </w:pPr>
     </w:lvl>
-    <w:lvl xmlns:w="http://schemas.openxmlformats.org/wordprocessingml/2006/main" w:ilvl="5">
+    <w:lvl w:ilvl="5" w:tplc="F62819C0">
       <w:start w:val="1"/>
       <w:numFmt w:val="lowerRoman"/>
       <w:lvlText w:val="%6."/>
@@ -862,7 +718,7 @@
         <w:ind w:left="4320" w:hanging="180"/>
       </w:pPr>
     </w:lvl>
-    <w:lvl xmlns:w="http://schemas.openxmlformats.org/wordprocessingml/2006/main" w:ilvl="6">
+    <w:lvl w:ilvl="6" w:tplc="4D96D272">
       <w:start w:val="1"/>
       <w:numFmt w:val="decimal"/>
       <w:lvlText w:val="%7."/>
@@ -871,7 +727,7 @@
         <w:ind w:left="5040" w:hanging="360"/>
       </w:pPr>
     </w:lvl>
-    <w:lvl xmlns:w="http://schemas.openxmlformats.org/wordprocessingml/2006/main" w:ilvl="7">
+    <w:lvl w:ilvl="7" w:tplc="F9B89E28">
       <w:start w:val="1"/>
       <w:numFmt w:val="lowerLetter"/>
       <w:lvlText w:val="%8."/>
@@ -880,7 +736,7 @@
         <w:ind w:left="5760" w:hanging="360"/>
       </w:pPr>
     </w:lvl>
-    <w:lvl xmlns:w="http://schemas.openxmlformats.org/wordprocessingml/2006/main" w:ilvl="8">
+    <w:lvl w:ilvl="8" w:tplc="EDAEAE0C">
       <w:start w:val="1"/>
       <w:numFmt w:val="lowerRoman"/>
       <w:lvlText w:val="%9."/>
@@ -890,10 +746,11 @@
       </w:pPr>
     </w:lvl>
   </w:abstractNum>
-  <w:abstractNum xmlns:w="http://schemas.openxmlformats.org/wordprocessingml/2006/main" w:abstractNumId="3">
-    <w:nsid w:val="71ae9c48"/>
-    <w:multiLevelType xmlns:w="http://schemas.openxmlformats.org/wordprocessingml/2006/main" w:val="hybridMultilevel"/>
-    <w:lvl xmlns:w="http://schemas.openxmlformats.org/wordprocessingml/2006/main" w:ilvl="0">
+  <w:abstractNum w:abstractNumId="1" w15:restartNumberingAfterBreak="0">
+    <w:nsid w:val="2F1B01A8"/>
+    <w:multiLevelType w:val="hybridMultilevel"/>
+    <w:tmpl w:val="7FE0217A"/>
+    <w:lvl w:ilvl="0" w:tplc="CB065CF0">
       <w:start w:val="1"/>
       <w:numFmt w:val="decimal"/>
       <w:lvlText w:val="%1."/>
@@ -902,7 +759,7 @@
         <w:ind w:left="720" w:hanging="360"/>
       </w:pPr>
     </w:lvl>
-    <w:lvl xmlns:w="http://schemas.openxmlformats.org/wordprocessingml/2006/main" w:ilvl="1">
+    <w:lvl w:ilvl="1" w:tplc="C1EE8062">
       <w:start w:val="1"/>
       <w:numFmt w:val="lowerLetter"/>
       <w:lvlText w:val="%2."/>
@@ -911,7 +768,7 @@
         <w:ind w:left="1440" w:hanging="360"/>
       </w:pPr>
     </w:lvl>
-    <w:lvl xmlns:w="http://schemas.openxmlformats.org/wordprocessingml/2006/main" w:ilvl="2">
+    <w:lvl w:ilvl="2" w:tplc="A27CE4BC">
       <w:start w:val="1"/>
       <w:numFmt w:val="lowerRoman"/>
       <w:lvlText w:val="%3."/>
@@ -920,7 +777,7 @@
         <w:ind w:left="2160" w:hanging="180"/>
       </w:pPr>
     </w:lvl>
-    <w:lvl xmlns:w="http://schemas.openxmlformats.org/wordprocessingml/2006/main" w:ilvl="3">
+    <w:lvl w:ilvl="3" w:tplc="A4C6DFD0">
       <w:start w:val="1"/>
       <w:numFmt w:val="decimal"/>
       <w:lvlText w:val="%4."/>
@@ -929,7 +786,7 @@
         <w:ind w:left="2880" w:hanging="360"/>
       </w:pPr>
     </w:lvl>
-    <w:lvl xmlns:w="http://schemas.openxmlformats.org/wordprocessingml/2006/main" w:ilvl="4">
+    <w:lvl w:ilvl="4" w:tplc="E110D2B8">
       <w:start w:val="1"/>
       <w:numFmt w:val="lowerLetter"/>
       <w:lvlText w:val="%5."/>
@@ -938,7 +795,7 @@
         <w:ind w:left="3600" w:hanging="360"/>
       </w:pPr>
     </w:lvl>
-    <w:lvl xmlns:w="http://schemas.openxmlformats.org/wordprocessingml/2006/main" w:ilvl="5">
+    <w:lvl w:ilvl="5" w:tplc="70DE7806">
       <w:start w:val="1"/>
       <w:numFmt w:val="lowerRoman"/>
       <w:lvlText w:val="%6."/>
@@ -947,7 +804,7 @@
         <w:ind w:left="4320" w:hanging="180"/>
       </w:pPr>
     </w:lvl>
-    <w:lvl xmlns:w="http://schemas.openxmlformats.org/wordprocessingml/2006/main" w:ilvl="6">
+    <w:lvl w:ilvl="6" w:tplc="FDD46B6A">
       <w:start w:val="1"/>
       <w:numFmt w:val="decimal"/>
       <w:lvlText w:val="%7."/>
@@ -956,7 +813,7 @@
         <w:ind w:left="5040" w:hanging="360"/>
       </w:pPr>
     </w:lvl>
-    <w:lvl xmlns:w="http://schemas.openxmlformats.org/wordprocessingml/2006/main" w:ilvl="7">
+    <w:lvl w:ilvl="7" w:tplc="34EE0396">
       <w:start w:val="1"/>
       <w:numFmt w:val="lowerLetter"/>
       <w:lvlText w:val="%8."/>
@@ -965,7 +822,7 @@
         <w:ind w:left="5760" w:hanging="360"/>
       </w:pPr>
     </w:lvl>
-    <w:lvl xmlns:w="http://schemas.openxmlformats.org/wordprocessingml/2006/main" w:ilvl="8">
+    <w:lvl w:ilvl="8" w:tplc="E30AA10C">
       <w:start w:val="1"/>
       <w:numFmt w:val="lowerRoman"/>
       <w:lvlText w:val="%9."/>
@@ -975,10 +832,11 @@
       </w:pPr>
     </w:lvl>
   </w:abstractNum>
-  <w:abstractNum xmlns:w="http://schemas.openxmlformats.org/wordprocessingml/2006/main" w:abstractNumId="2">
-    <w:nsid w:val="17eb1adf"/>
-    <w:multiLevelType xmlns:w="http://schemas.openxmlformats.org/wordprocessingml/2006/main" w:val="hybridMultilevel"/>
-    <w:lvl xmlns:w="http://schemas.openxmlformats.org/wordprocessingml/2006/main" w:ilvl="0">
+  <w:abstractNum w:abstractNumId="2" w15:restartNumberingAfterBreak="0">
+    <w:nsid w:val="3DC38BA8"/>
+    <w:multiLevelType w:val="hybridMultilevel"/>
+    <w:tmpl w:val="F3FE194C"/>
+    <w:lvl w:ilvl="0" w:tplc="ED927CAC">
       <w:start w:val="1"/>
       <w:numFmt w:val="decimal"/>
       <w:lvlText w:val="%1."/>
@@ -987,7 +845,7 @@
         <w:ind w:left="720" w:hanging="360"/>
       </w:pPr>
     </w:lvl>
-    <w:lvl xmlns:w="http://schemas.openxmlformats.org/wordprocessingml/2006/main" w:ilvl="1">
+    <w:lvl w:ilvl="1" w:tplc="57D29E3A">
       <w:start w:val="1"/>
       <w:numFmt w:val="lowerLetter"/>
       <w:lvlText w:val="%2."/>
@@ -996,7 +854,7 @@
         <w:ind w:left="1440" w:hanging="360"/>
       </w:pPr>
     </w:lvl>
-    <w:lvl xmlns:w="http://schemas.openxmlformats.org/wordprocessingml/2006/main" w:ilvl="2">
+    <w:lvl w:ilvl="2" w:tplc="7FCC12C8">
       <w:start w:val="1"/>
       <w:numFmt w:val="lowerRoman"/>
       <w:lvlText w:val="%3."/>
@@ -1005,7 +863,7 @@
         <w:ind w:left="2160" w:hanging="180"/>
       </w:pPr>
     </w:lvl>
-    <w:lvl xmlns:w="http://schemas.openxmlformats.org/wordprocessingml/2006/main" w:ilvl="3">
+    <w:lvl w:ilvl="3" w:tplc="073E0FEC">
       <w:start w:val="1"/>
       <w:numFmt w:val="decimal"/>
       <w:lvlText w:val="%4."/>
@@ -1014,7 +872,7 @@
         <w:ind w:left="2880" w:hanging="360"/>
       </w:pPr>
     </w:lvl>
-    <w:lvl xmlns:w="http://schemas.openxmlformats.org/wordprocessingml/2006/main" w:ilvl="4">
+    <w:lvl w:ilvl="4" w:tplc="3A064472">
       <w:start w:val="1"/>
       <w:numFmt w:val="lowerLetter"/>
       <w:lvlText w:val="%5."/>
@@ -1023,7 +881,7 @@
         <w:ind w:left="3600" w:hanging="360"/>
       </w:pPr>
     </w:lvl>
-    <w:lvl xmlns:w="http://schemas.openxmlformats.org/wordprocessingml/2006/main" w:ilvl="5">
+    <w:lvl w:ilvl="5" w:tplc="30D6EFD0">
       <w:start w:val="1"/>
       <w:numFmt w:val="lowerRoman"/>
       <w:lvlText w:val="%6."/>
@@ -1032,7 +890,7 @@
         <w:ind w:left="4320" w:hanging="180"/>
       </w:pPr>
     </w:lvl>
-    <w:lvl xmlns:w="http://schemas.openxmlformats.org/wordprocessingml/2006/main" w:ilvl="6">
+    <w:lvl w:ilvl="6" w:tplc="8C868536">
       <w:start w:val="1"/>
       <w:numFmt w:val="decimal"/>
       <w:lvlText w:val="%7."/>
@@ -1041,7 +899,7 @@
         <w:ind w:left="5040" w:hanging="360"/>
       </w:pPr>
     </w:lvl>
-    <w:lvl xmlns:w="http://schemas.openxmlformats.org/wordprocessingml/2006/main" w:ilvl="7">
+    <w:lvl w:ilvl="7" w:tplc="D412641A">
       <w:start w:val="1"/>
       <w:numFmt w:val="lowerLetter"/>
       <w:lvlText w:val="%8."/>
@@ -1050,7 +908,7 @@
         <w:ind w:left="5760" w:hanging="360"/>
       </w:pPr>
     </w:lvl>
-    <w:lvl xmlns:w="http://schemas.openxmlformats.org/wordprocessingml/2006/main" w:ilvl="8">
+    <w:lvl w:ilvl="8" w:tplc="BA9C60C4">
       <w:start w:val="1"/>
       <w:numFmt w:val="lowerRoman"/>
       <w:lvlText w:val="%9."/>
@@ -1060,10 +918,11 @@
       </w:pPr>
     </w:lvl>
   </w:abstractNum>
-  <w:abstractNum xmlns:w="http://schemas.openxmlformats.org/wordprocessingml/2006/main" w:abstractNumId="1">
-    <w:nsid w:val="2f1b01a8"/>
-    <w:multiLevelType xmlns:w="http://schemas.openxmlformats.org/wordprocessingml/2006/main" w:val="hybridMultilevel"/>
-    <w:lvl xmlns:w="http://schemas.openxmlformats.org/wordprocessingml/2006/main" w:ilvl="0">
+  <w:abstractNum w:abstractNumId="3" w15:restartNumberingAfterBreak="0">
+    <w:nsid w:val="71AE9C48"/>
+    <w:multiLevelType w:val="hybridMultilevel"/>
+    <w:tmpl w:val="6A047C12"/>
+    <w:lvl w:ilvl="0" w:tplc="4E686CD4">
       <w:start w:val="1"/>
       <w:numFmt w:val="decimal"/>
       <w:lvlText w:val="%1."/>
@@ -1072,7 +931,7 @@
         <w:ind w:left="720" w:hanging="360"/>
       </w:pPr>
     </w:lvl>
-    <w:lvl xmlns:w="http://schemas.openxmlformats.org/wordprocessingml/2006/main" w:ilvl="1">
+    <w:lvl w:ilvl="1" w:tplc="8CB468A8">
       <w:start w:val="1"/>
       <w:numFmt w:val="lowerLetter"/>
       <w:lvlText w:val="%2."/>
@@ -1081,7 +940,7 @@
         <w:ind w:left="1440" w:hanging="360"/>
       </w:pPr>
     </w:lvl>
-    <w:lvl xmlns:w="http://schemas.openxmlformats.org/wordprocessingml/2006/main" w:ilvl="2">
+    <w:lvl w:ilvl="2" w:tplc="6D5C024E">
       <w:start w:val="1"/>
       <w:numFmt w:val="lowerRoman"/>
       <w:lvlText w:val="%3."/>
@@ -1090,7 +949,7 @@
         <w:ind w:left="2160" w:hanging="180"/>
       </w:pPr>
     </w:lvl>
-    <w:lvl xmlns:w="http://schemas.openxmlformats.org/wordprocessingml/2006/main" w:ilvl="3">
+    <w:lvl w:ilvl="3" w:tplc="BAF8684A">
       <w:start w:val="1"/>
       <w:numFmt w:val="decimal"/>
       <w:lvlText w:val="%4."/>
@@ -1099,7 +958,7 @@
         <w:ind w:left="2880" w:hanging="360"/>
       </w:pPr>
     </w:lvl>
-    <w:lvl xmlns:w="http://schemas.openxmlformats.org/wordprocessingml/2006/main" w:ilvl="4">
+    <w:lvl w:ilvl="4" w:tplc="431AAA28">
       <w:start w:val="1"/>
       <w:numFmt w:val="lowerLetter"/>
       <w:lvlText w:val="%5."/>
@@ -1108,7 +967,7 @@
         <w:ind w:left="3600" w:hanging="360"/>
       </w:pPr>
     </w:lvl>
-    <w:lvl xmlns:w="http://schemas.openxmlformats.org/wordprocessingml/2006/main" w:ilvl="5">
+    <w:lvl w:ilvl="5" w:tplc="6E6C8DD8">
       <w:start w:val="1"/>
       <w:numFmt w:val="lowerRoman"/>
       <w:lvlText w:val="%6."/>
@@ -1117,7 +976,7 @@
         <w:ind w:left="4320" w:hanging="180"/>
       </w:pPr>
     </w:lvl>
-    <w:lvl xmlns:w="http://schemas.openxmlformats.org/wordprocessingml/2006/main" w:ilvl="6">
+    <w:lvl w:ilvl="6" w:tplc="30908362">
       <w:start w:val="1"/>
       <w:numFmt w:val="decimal"/>
       <w:lvlText w:val="%7."/>
@@ -1126,7 +985,7 @@
         <w:ind w:left="5040" w:hanging="360"/>
       </w:pPr>
     </w:lvl>
-    <w:lvl xmlns:w="http://schemas.openxmlformats.org/wordprocessingml/2006/main" w:ilvl="7">
+    <w:lvl w:ilvl="7" w:tplc="D3BEDB1C">
       <w:start w:val="1"/>
       <w:numFmt w:val="lowerLetter"/>
       <w:lvlText w:val="%8."/>
@@ -1135,7 +994,7 @@
         <w:ind w:left="5760" w:hanging="360"/>
       </w:pPr>
     </w:lvl>
-    <w:lvl xmlns:w="http://schemas.openxmlformats.org/wordprocessingml/2006/main" w:ilvl="8">
+    <w:lvl w:ilvl="8" w:tplc="5B9279B4">
       <w:start w:val="1"/>
       <w:numFmt w:val="lowerRoman"/>
       <w:lvlText w:val="%9."/>
@@ -1145,27 +1004,27 @@
       </w:pPr>
     </w:lvl>
   </w:abstractNum>
-  <w:num w:numId="4">
-    <w:abstractNumId w:val="4"/>
+  <w:num w:numId="1" w16cid:durableId="2087874276">
+    <w:abstractNumId w:val="2"/>
   </w:num>
-  <w:num w:numId="3">
+  <w:num w:numId="2" w16cid:durableId="231740611">
     <w:abstractNumId w:val="3"/>
   </w:num>
-  <w:num w:numId="2">
-    <w:abstractNumId w:val="2"/>
+  <w:num w:numId="3" w16cid:durableId="332530076">
+    <w:abstractNumId w:val="0"/>
   </w:num>
-  <w:num w:numId="1">
+  <w:num w:numId="4" w16cid:durableId="1102533544">
     <w:abstractNumId w:val="1"/>
   </w:num>
 </w:numbering>
 </file>
 
 <file path=word/styles.xml><?xml version="1.0" encoding="utf-8"?>
-<w:styles xmlns:wp14="http://schemas.microsoft.com/office/word/2010/wordprocessingDrawing" xmlns:mc="http://schemas.openxmlformats.org/markup-compatibility/2006" xmlns:r="http://schemas.openxmlformats.org/officeDocument/2006/relationships" xmlns:w="http://schemas.openxmlformats.org/wordprocessingml/2006/main" xmlns:w14="http://schemas.microsoft.com/office/word/2010/wordml" xmlns:w15="http://schemas.microsoft.com/office/word/2012/wordml" xmlns:w16se="http://schemas.microsoft.com/office/word/2015/wordml/symex" xmlns:w16cid="http://schemas.microsoft.com/office/word/2016/wordml/cid" xmlns:w16="http://schemas.microsoft.com/office/word/2018/wordml" xmlns:w16cex="http://schemas.microsoft.com/office/word/2018/wordml/cex" xmlns:w16sdtdh="http://schemas.microsoft.com/office/word/2020/wordml/sdtdatahash" xmlns:w16sdtfl="http://schemas.microsoft.com/office/word/2024/wordml/sdtformatlock" mc:Ignorable="w14 w15 wp14 w16se w16cid w16 w16cex w16sdtdh w16sdtfl">
+<w:styles xmlns:mc="http://schemas.openxmlformats.org/markup-compatibility/2006" xmlns:r="http://schemas.openxmlformats.org/officeDocument/2006/relationships" xmlns:w="http://schemas.openxmlformats.org/wordprocessingml/2006/main" xmlns:w14="http://schemas.microsoft.com/office/word/2010/wordml" xmlns:w15="http://schemas.microsoft.com/office/word/2012/wordml" xmlns:w16cex="http://schemas.microsoft.com/office/word/2018/wordml/cex" xmlns:w16cid="http://schemas.microsoft.com/office/word/2016/wordml/cid" xmlns:w16="http://schemas.microsoft.com/office/word/2018/wordml" xmlns:w16du="http://schemas.microsoft.com/office/word/2023/wordml/word16du" xmlns:w16sdtdh="http://schemas.microsoft.com/office/word/2020/wordml/sdtdatahash" xmlns:w16sdtfl="http://schemas.microsoft.com/office/word/2024/wordml/sdtformatlock" xmlns:w16se="http://schemas.microsoft.com/office/word/2015/wordml/symex" mc:Ignorable="w14 w15 w16se w16cid w16 w16cex w16sdtdh w16sdtfl w16du">
   <w:docDefaults>
     <w:rPrDefault>
       <w:rPr>
-        <w:rFonts w:asciiTheme="minorHAnsi" w:hAnsiTheme="minorHAnsi" w:eastAsiaTheme="minorHAnsi" w:cstheme="minorBidi"/>
+        <w:rFonts w:asciiTheme="minorHAnsi" w:eastAsiaTheme="minorHAnsi" w:hAnsiTheme="minorHAnsi" w:cstheme="minorBidi"/>
         <w:sz w:val="24"/>
         <w:szCs w:val="24"/>
         <w:lang w:val="pt-BR" w:eastAsia="en-US" w:bidi="ar-SA"/>
@@ -1177,17 +1036,17 @@
       </w:pPr>
     </w:pPrDefault>
   </w:docDefaults>
-  <w:latentStyles w:defLockedState="0" w:defUIPriority="99" w:defSemiHidden="0" w:defUnhideWhenUsed="0" w:defQFormat="0" w:count="371">
+  <w:latentStyles w:defLockedState="0" w:defUIPriority="99" w:defSemiHidden="0" w:defUnhideWhenUsed="0" w:defQFormat="0" w:count="376">
     <w:lsdException w:name="Normal" w:uiPriority="0" w:qFormat="1"/>
     <w:lsdException w:name="heading 1" w:uiPriority="9" w:qFormat="1"/>
-    <w:lsdException w:name="heading 2" w:uiPriority="9" w:semiHidden="1" w:unhideWhenUsed="1" w:qFormat="1"/>
-    <w:lsdException w:name="heading 3" w:uiPriority="9" w:semiHidden="1" w:unhideWhenUsed="1" w:qFormat="1"/>
-    <w:lsdException w:name="heading 4" w:uiPriority="9" w:semiHidden="1" w:unhideWhenUsed="1" w:qFormat="1"/>
-    <w:lsdException w:name="heading 5" w:uiPriority="9" w:semiHidden="1" w:unhideWhenUsed="1" w:qFormat="1"/>
-    <w:lsdException w:name="heading 6" w:uiPriority="9" w:semiHidden="1" w:unhideWhenUsed="1" w:qFormat="1"/>
-    <w:lsdException w:name="heading 7" w:uiPriority="9" w:semiHidden="1" w:unhideWhenUsed="1" w:qFormat="1"/>
-    <w:lsdException w:name="heading 8" w:uiPriority="9" w:semiHidden="1" w:unhideWhenUsed="1" w:qFormat="1"/>
-    <w:lsdException w:name="heading 9" w:uiPriority="9" w:semiHidden="1" w:unhideWhenUsed="1" w:qFormat="1"/>
+    <w:lsdException w:name="heading 2" w:semiHidden="1" w:uiPriority="9" w:unhideWhenUsed="1" w:qFormat="1"/>
+    <w:lsdException w:name="heading 3" w:semiHidden="1" w:uiPriority="9" w:unhideWhenUsed="1" w:qFormat="1"/>
+    <w:lsdException w:name="heading 4" w:semiHidden="1" w:uiPriority="9" w:unhideWhenUsed="1" w:qFormat="1"/>
+    <w:lsdException w:name="heading 5" w:semiHidden="1" w:uiPriority="9" w:unhideWhenUsed="1" w:qFormat="1"/>
+    <w:lsdException w:name="heading 6" w:semiHidden="1" w:uiPriority="9" w:unhideWhenUsed="1" w:qFormat="1"/>
+    <w:lsdException w:name="heading 7" w:semiHidden="1" w:uiPriority="9" w:unhideWhenUsed="1" w:qFormat="1"/>
+    <w:lsdException w:name="heading 8" w:semiHidden="1" w:uiPriority="9" w:unhideWhenUsed="1" w:qFormat="1"/>
+    <w:lsdException w:name="heading 9" w:semiHidden="1" w:uiPriority="9" w:unhideWhenUsed="1" w:qFormat="1"/>
     <w:lsdException w:name="index 1" w:semiHidden="1" w:unhideWhenUsed="1"/>
     <w:lsdException w:name="index 2" w:semiHidden="1" w:unhideWhenUsed="1"/>
     <w:lsdException w:name="index 3" w:semiHidden="1" w:unhideWhenUsed="1"/>
@@ -1197,22 +1056,22 @@
     <w:lsdException w:name="index 7" w:semiHidden="1" w:unhideWhenUsed="1"/>
     <w:lsdException w:name="index 8" w:semiHidden="1" w:unhideWhenUsed="1"/>
     <w:lsdException w:name="index 9" w:semiHidden="1" w:unhideWhenUsed="1"/>
-    <w:lsdException w:name="toc 1" w:uiPriority="39" w:semiHidden="1" w:unhideWhenUsed="1"/>
-    <w:lsdException w:name="toc 2" w:uiPriority="39" w:semiHidden="1" w:unhideWhenUsed="1"/>
-    <w:lsdException w:name="toc 3" w:uiPriority="39" w:semiHidden="1" w:unhideWhenUsed="1"/>
-    <w:lsdException w:name="toc 4" w:uiPriority="39" w:semiHidden="1" w:unhideWhenUsed="1"/>
-    <w:lsdException w:name="toc 5" w:uiPriority="39" w:semiHidden="1" w:unhideWhenUsed="1"/>
-    <w:lsdException w:name="toc 6" w:uiPriority="39" w:semiHidden="1" w:unhideWhenUsed="1"/>
-    <w:lsdException w:name="toc 7" w:uiPriority="39" w:semiHidden="1" w:unhideWhenUsed="1"/>
-    <w:lsdException w:name="toc 8" w:uiPriority="39" w:semiHidden="1" w:unhideWhenUsed="1"/>
-    <w:lsdException w:name="toc 9" w:uiPriority="39" w:semiHidden="1" w:unhideWhenUsed="1"/>
+    <w:lsdException w:name="toc 1" w:semiHidden="1" w:uiPriority="39" w:unhideWhenUsed="1"/>
+    <w:lsdException w:name="toc 2" w:semiHidden="1" w:uiPriority="39" w:unhideWhenUsed="1"/>
+    <w:lsdException w:name="toc 3" w:semiHidden="1" w:uiPriority="39" w:unhideWhenUsed="1"/>
+    <w:lsdException w:name="toc 4" w:semiHidden="1" w:uiPriority="39" w:unhideWhenUsed="1"/>
+    <w:lsdException w:name="toc 5" w:semiHidden="1" w:uiPriority="39" w:unhideWhenUsed="1"/>
+    <w:lsdException w:name="toc 6" w:semiHidden="1" w:uiPriority="39" w:unhideWhenUsed="1"/>
+    <w:lsdException w:name="toc 7" w:semiHidden="1" w:uiPriority="39" w:unhideWhenUsed="1"/>
+    <w:lsdException w:name="toc 8" w:semiHidden="1" w:uiPriority="39" w:unhideWhenUsed="1"/>
+    <w:lsdException w:name="toc 9" w:semiHidden="1" w:uiPriority="39" w:unhideWhenUsed="1"/>
     <w:lsdException w:name="Normal Indent" w:semiHidden="1" w:unhideWhenUsed="1"/>
     <w:lsdException w:name="footnote text" w:semiHidden="1" w:unhideWhenUsed="1"/>
     <w:lsdException w:name="annotation text" w:semiHidden="1" w:unhideWhenUsed="1"/>
     <w:lsdException w:name="header" w:semiHidden="1" w:unhideWhenUsed="1"/>
     <w:lsdException w:name="footer" w:semiHidden="1" w:unhideWhenUsed="1"/>
     <w:lsdException w:name="index heading" w:semiHidden="1" w:unhideWhenUsed="1"/>
-    <w:lsdException w:name="caption" w:uiPriority="35" w:semiHidden="1" w:unhideWhenUsed="1" w:qFormat="1"/>
+    <w:lsdException w:name="caption" w:semiHidden="1" w:uiPriority="35" w:unhideWhenUsed="1" w:qFormat="1"/>
     <w:lsdException w:name="table of figures" w:semiHidden="1" w:unhideWhenUsed="1"/>
     <w:lsdException w:name="envelope address" w:semiHidden="1" w:unhideWhenUsed="1"/>
     <w:lsdException w:name="envelope return" w:semiHidden="1" w:unhideWhenUsed="1"/>
@@ -1243,7 +1102,7 @@
     <w:lsdException w:name="Title" w:uiPriority="10" w:qFormat="1"/>
     <w:lsdException w:name="Closing" w:semiHidden="1" w:unhideWhenUsed="1"/>
     <w:lsdException w:name="Signature" w:semiHidden="1" w:unhideWhenUsed="1"/>
-    <w:lsdException w:name="Default Paragraph Font" w:uiPriority="1" w:semiHidden="1" w:unhideWhenUsed="1"/>
+    <w:lsdException w:name="Default Paragraph Font" w:semiHidden="1" w:uiPriority="1" w:unhideWhenUsed="1"/>
     <w:lsdException w:name="Body Text" w:semiHidden="1" w:unhideWhenUsed="1"/>
     <w:lsdException w:name="Body Text Indent" w:semiHidden="1" w:unhideWhenUsed="1"/>
     <w:lsdException w:name="List Continue" w:semiHidden="1" w:unhideWhenUsed="1"/>
@@ -1443,8 +1302,8 @@
     <w:lsdException w:name="Subtle Reference" w:uiPriority="31" w:qFormat="1"/>
     <w:lsdException w:name="Intense Reference" w:uiPriority="32" w:qFormat="1"/>
     <w:lsdException w:name="Book Title" w:uiPriority="33" w:qFormat="1"/>
-    <w:lsdException w:name="Bibliography" w:uiPriority="37" w:semiHidden="1" w:unhideWhenUsed="1"/>
-    <w:lsdException w:name="TOC Heading" w:uiPriority="39" w:semiHidden="1" w:unhideWhenUsed="1" w:qFormat="1"/>
+    <w:lsdException w:name="Bibliography" w:semiHidden="1" w:uiPriority="37" w:unhideWhenUsed="1"/>
+    <w:lsdException w:name="TOC Heading" w:semiHidden="1" w:uiPriority="39" w:unhideWhenUsed="1" w:qFormat="1"/>
     <w:lsdException w:name="Plain Table 1" w:uiPriority="41"/>
     <w:lsdException w:name="Plain Table 2" w:uiPriority="42"/>
     <w:lsdException w:name="Plain Table 3" w:uiPriority="43"/>
@@ -1549,18 +1408,23 @@
     <w:lsdException w:name="List Table 5 Dark Accent 6" w:uiPriority="50"/>
     <w:lsdException w:name="List Table 6 Colorful Accent 6" w:uiPriority="51"/>
     <w:lsdException w:name="List Table 7 Colorful Accent 6" w:uiPriority="52"/>
+    <w:lsdException w:name="Mention" w:semiHidden="1" w:unhideWhenUsed="1"/>
+    <w:lsdException w:name="Smart Hyperlink" w:semiHidden="1" w:unhideWhenUsed="1"/>
+    <w:lsdException w:name="Hashtag" w:semiHidden="1" w:unhideWhenUsed="1"/>
+    <w:lsdException w:name="Unresolved Mention" w:semiHidden="1" w:unhideWhenUsed="1"/>
+    <w:lsdException w:name="Smart Link" w:semiHidden="1" w:unhideWhenUsed="1"/>
   </w:latentStyles>
-  <w:style w:type="paragraph" w:styleId="Normal" w:default="1">
+  <w:style w:type="paragraph" w:default="1" w:styleId="Normal">
     <w:name w:val="Normal"/>
     <w:qFormat/>
   </w:style>
-  <w:style w:type="character" w:styleId="DefaultParagraphFont" w:default="1">
+  <w:style w:type="character" w:default="1" w:styleId="Fontepargpadro">
     <w:name w:val="Default Paragraph Font"/>
     <w:uiPriority w:val="1"/>
     <w:semiHidden/>
     <w:unhideWhenUsed/>
   </w:style>
-  <w:style w:type="table" w:styleId="TableNormal" w:default="1">
+  <w:style w:type="table" w:default="1" w:styleId="Tabelanormal">
     <w:name w:val="Normal Table"/>
     <w:uiPriority w:val="99"/>
     <w:semiHidden/>
@@ -1575,27 +1439,27 @@
       </w:tblCellMar>
     </w:tblPr>
   </w:style>
-  <w:style w:type="numbering" w:styleId="NoList" w:default="1">
+  <w:style w:type="numbering" w:default="1" w:styleId="Semlista">
     <w:name w:val="No List"/>
     <w:uiPriority w:val="99"/>
     <w:semiHidden/>
     <w:unhideWhenUsed/>
   </w:style>
-  <w:style xmlns:w14="http://schemas.microsoft.com/office/word/2010/wordml" xmlns:mc="http://schemas.openxmlformats.org/markup-compatibility/2006" xmlns:w="http://schemas.openxmlformats.org/wordprocessingml/2006/main" w:type="paragraph" w:styleId="ListParagraph" mc:Ignorable="w14">
-    <w:name xmlns:w="http://schemas.openxmlformats.org/wordprocessingml/2006/main" w:val="List Paragraph"/>
-    <w:basedOn xmlns:w="http://schemas.openxmlformats.org/wordprocessingml/2006/main" w:val="Normal"/>
-    <w:uiPriority xmlns:w="http://schemas.openxmlformats.org/wordprocessingml/2006/main" w:val="34"/>
-    <w:qFormat xmlns:w="http://schemas.openxmlformats.org/wordprocessingml/2006/main"/>
-    <w:pPr xmlns:w="http://schemas.openxmlformats.org/wordprocessingml/2006/main">
-      <w:ind xmlns:w="http://schemas.openxmlformats.org/wordprocessingml/2006/main" w:left="720"/>
-      <w:contextualSpacing xmlns:w="http://schemas.openxmlformats.org/wordprocessingml/2006/main"/>
+  <w:style w:type="paragraph" w:styleId="PargrafodaLista">
+    <w:name w:val="List Paragraph"/>
+    <w:basedOn w:val="Normal"/>
+    <w:uiPriority w:val="34"/>
+    <w:qFormat/>
+    <w:pPr>
+      <w:ind w:left="720"/>
+      <w:contextualSpacing/>
     </w:pPr>
   </w:style>
 </w:styles>
 </file>
 
 <file path=word/theme/theme1.xml><?xml version="1.0" encoding="utf-8"?>
-<a:theme xmlns:thm15="http://schemas.microsoft.com/office/thememl/2012/main" xmlns:a="http://schemas.openxmlformats.org/drawingml/2006/main" name="Office Theme">
+<a:theme xmlns:a="http://schemas.openxmlformats.org/drawingml/2006/main" name="Office Theme">
   <a:themeElements>
     <a:clrScheme name="Office">
       <a:dk1>
@@ -1856,8 +1720,8 @@
 </file>
 
 <file path=customXml/item1.xml><?xml version="1.0" encoding="utf-8"?>
-<ct:contentTypeSchema xmlns:ct="http://schemas.microsoft.com/office/2006/metadata/contentType" xmlns:ma="http://schemas.microsoft.com/office/2006/metadata/properties/metaAttributes" ct:_="" ma:_="" ma:contentTypeName="Documento" ma:contentTypeID="0x0101002D05F9E5B40ED144A205A029D99A4039" ma:contentTypeVersion="19" ma:contentTypeDescription="Criar um novo documento." ma:contentTypeScope="" ma:versionID="971f028fa575002c93995ac15e54fcff">
-  <xsd:schema xmlns:xsd="http://www.w3.org/2001/XMLSchema" xmlns:xs="http://www.w3.org/2001/XMLSchema" xmlns:p="http://schemas.microsoft.com/office/2006/metadata/properties" xmlns:ns2="ddee34cc-00f6-4275-aa67-a8ae1ff94836" xmlns:ns3="11650913-886e-4af1-8fb4-e96f880a527d" targetNamespace="http://schemas.microsoft.com/office/2006/metadata/properties" ma:root="true" ma:fieldsID="7fd2645d2905ffe898fd8a0aba610105" ns2:_="" ns3:_="">
+<ct:contentTypeSchema xmlns:ct="http://schemas.microsoft.com/office/2006/metadata/contentType" xmlns:ma="http://schemas.microsoft.com/office/2006/metadata/properties/metaAttributes" ct:_="" ma:_="" ma:contentTypeName="Documento" ma:contentTypeID="0x0101002D05F9E5B40ED144A205A029D99A4039" ma:contentTypeVersion="19" ma:contentTypeDescription="Criar um novo documento." ma:contentTypeScope="" ma:versionID="a3e102bf62a25be44fc89b6194253c8b">
+  <xsd:schema xmlns:xsd="http://www.w3.org/2001/XMLSchema" xmlns:xs="http://www.w3.org/2001/XMLSchema" xmlns:p="http://schemas.microsoft.com/office/2006/metadata/properties" xmlns:ns2="ddee34cc-00f6-4275-aa67-a8ae1ff94836" xmlns:ns3="11650913-886e-4af1-8fb4-e96f880a527d" targetNamespace="http://schemas.microsoft.com/office/2006/metadata/properties" ma:root="true" ma:fieldsID="2fb2d230953d692650d2a032a3800c8d" ns2:_="" ns3:_="">
     <xsd:import namespace="ddee34cc-00f6-4275-aa67-a8ae1ff94836"/>
     <xsd:import namespace="11650913-886e-4af1-8fb4-e96f880a527d"/>
     <xsd:element name="properties">
@@ -2137,13 +2001,39 @@
 </file>
 
 <file path=customXml/itemProps1.xml><?xml version="1.0" encoding="utf-8"?>
-<ds:datastoreItem xmlns:ds="http://schemas.openxmlformats.org/officeDocument/2006/customXml" ds:itemID="{CB843611-D89D-4E12-99E2-1E6370129F22}"/>
+<ds:datastoreItem xmlns:ds="http://schemas.openxmlformats.org/officeDocument/2006/customXml" ds:itemID="{9EFA8AA5-6827-4CE1-BFDD-87FA91208CAC}">
+  <ds:schemaRefs>
+    <ds:schemaRef ds:uri="http://schemas.microsoft.com/office/2006/metadata/contentType"/>
+    <ds:schemaRef ds:uri="http://schemas.microsoft.com/office/2006/metadata/properties/metaAttributes"/>
+    <ds:schemaRef ds:uri="http://www.w3.org/2001/XMLSchema"/>
+    <ds:schemaRef ds:uri="http://schemas.microsoft.com/office/2006/metadata/properties"/>
+    <ds:schemaRef ds:uri="ddee34cc-00f6-4275-aa67-a8ae1ff94836"/>
+    <ds:schemaRef ds:uri="11650913-886e-4af1-8fb4-e96f880a527d"/>
+    <ds:schemaRef ds:uri="http://schemas.microsoft.com/office/2006/documentManagement/types"/>
+    <ds:schemaRef ds:uri="http://schemas.microsoft.com/office/infopath/2007/PartnerControls"/>
+    <ds:schemaRef ds:uri="http://schemas.openxmlformats.org/package/2006/metadata/core-properties"/>
+    <ds:schemaRef ds:uri="http://purl.org/dc/elements/1.1/"/>
+    <ds:schemaRef ds:uri="http://purl.org/dc/terms/"/>
+    <ds:schemaRef ds:uri="http://schemas.microsoft.com/internal/obd"/>
+  </ds:schemaRefs>
+</ds:datastoreItem>
 </file>
 
 <file path=customXml/itemProps2.xml><?xml version="1.0" encoding="utf-8"?>
-<ds:datastoreItem xmlns:ds="http://schemas.openxmlformats.org/officeDocument/2006/customXml" ds:itemID="{0111B112-8AAA-4028-A5C3-BFBD6EDBB62F}"/>
+<ds:datastoreItem xmlns:ds="http://schemas.openxmlformats.org/officeDocument/2006/customXml" ds:itemID="{0111B112-8AAA-4028-A5C3-BFBD6EDBB62F}">
+  <ds:schemaRefs>
+    <ds:schemaRef ds:uri="http://schemas.microsoft.com/sharepoint/v3/contenttype/forms"/>
+  </ds:schemaRefs>
+</ds:datastoreItem>
 </file>
 
 <file path=customXml/itemProps3.xml><?xml version="1.0" encoding="utf-8"?>
-<ds:datastoreItem xmlns:ds="http://schemas.openxmlformats.org/officeDocument/2006/customXml" ds:itemID="{94A81A2F-4BC2-4AFA-8ACF-0E68CA6E53D7}"/>
+<ds:datastoreItem xmlns:ds="http://schemas.openxmlformats.org/officeDocument/2006/customXml" ds:itemID="{94A81A2F-4BC2-4AFA-8ACF-0E68CA6E53D7}">
+  <ds:schemaRefs>
+    <ds:schemaRef ds:uri="http://schemas.microsoft.com/office/2006/metadata/properties"/>
+    <ds:schemaRef ds:uri="http://schemas.microsoft.com/office/infopath/2007/PartnerControls"/>
+    <ds:schemaRef ds:uri="ddee34cc-00f6-4275-aa67-a8ae1ff94836"/>
+    <ds:schemaRef ds:uri="11650913-886e-4af1-8fb4-e96f880a527d"/>
+  </ds:schemaRefs>
+</ds:datastoreItem>
 </file>
</xml_diff>

<commit_message>
feat: VD+ para hibridas
</commit_message>
<xml_diff>
--- a/00. Piloto da KALK/PILOTO DA KALK.docx
+++ b/00. Piloto da KALK/PILOTO DA KALK.docx
@@ -87,7 +87,7 @@
           <w:sz w:val="21"/>
           <w:szCs w:val="21"/>
         </w:rPr>
-        <w:t>1</w:t>
+        <w:t>3</w:t>
       </w:r>
       <w:r>
         <w:rPr>
@@ -150,7 +150,7 @@
           <w:sz w:val="21"/>
           <w:szCs w:val="21"/>
         </w:rPr>
-        <w:t>5</w:t>
+        <w:t>4</w:t>
       </w:r>
       <w:r>
         <w:rPr>
@@ -175,6 +175,30 @@
           <w:szCs w:val="21"/>
         </w:rPr>
       </w:pPr>
+      <w:r>
+        <w:rPr>
+          <w:rFonts w:ascii="Segoe UI" w:hAnsi="Segoe UI" w:eastAsia="Segoe UI" w:cs="Segoe UI"/>
+          <w:sz w:val="21"/>
+          <w:szCs w:val="21"/>
+        </w:rPr>
+        <w:t xml:space="preserve">Ceará-mirim (abaixo do ideal – </w:t>
+      </w:r>
+      <w:r>
+        <w:rPr>
+          <w:rFonts w:ascii="Segoe UI" w:hAnsi="Segoe UI" w:eastAsia="Segoe UI" w:cs="Segoe UI"/>
+          <w:sz w:val="21"/>
+          <w:szCs w:val="21"/>
+        </w:rPr>
+        <w:t>3</w:t>
+      </w:r>
+      <w:r>
+        <w:rPr>
+          <w:rFonts w:ascii="Segoe UI" w:hAnsi="Segoe UI" w:eastAsia="Segoe UI" w:cs="Segoe UI"/>
+          <w:sz w:val="21"/>
+          <w:szCs w:val="21"/>
+        </w:rPr>
+        <w:t>)</w:t>
+      </w:r>
     </w:p>
     <w:p>
       <w:pPr>

</xml_diff>